<commit_message>
ADD se agregan ADR-0004 al ADR-0007
</commit_message>
<xml_diff>
--- a/exports/word/ADR-0001-Uso_RDA_fuente_de_verdad_decisiones_arquitectónicas.docx
+++ b/exports/word/ADR-0001-Uso_RDA_fuente_de_verdad_decisiones_arquitectónicas.docx
@@ -160,14 +160,12 @@
             <w:tcW w:w="6768" w:type="dxa"/>
           </w:tcPr>
           <w:p>
-            <w:proofErr w:type="spellStart"/>
             <w:r>
               <w:rPr>
                 <w:sz w:val="17"/>
               </w:rPr>
               <w:t>Propuesto</w:t>
             </w:r>
-            <w:proofErr w:type="spellEnd"/>
           </w:p>
         </w:tc>
       </w:tr>
@@ -245,40 +243,24 @@
             <w:tcW w:w="3024" w:type="dxa"/>
           </w:tcPr>
           <w:p>
-            <w:proofErr w:type="spellStart"/>
             <w:r>
               <w:rPr>
                 <w:sz w:val="17"/>
               </w:rPr>
-              <w:t>Responsable</w:t>
-            </w:r>
-            <w:proofErr w:type="spellEnd"/>
+              <w:t>Responsable principal</w:t>
+            </w:r>
+          </w:p>
+        </w:tc>
+        <w:tc>
+          <w:tcPr>
+            <w:tcW w:w="6768" w:type="dxa"/>
+          </w:tcPr>
+          <w:p>
             <w:r>
               <w:rPr>
                 <w:sz w:val="17"/>
               </w:rPr>
-              <w:t xml:space="preserve"> principal</w:t>
-            </w:r>
-          </w:p>
-        </w:tc>
-        <w:tc>
-          <w:tcPr>
-            <w:tcW w:w="6768" w:type="dxa"/>
-          </w:tcPr>
-          <w:p>
-            <w:proofErr w:type="spellStart"/>
-            <w:r>
-              <w:rPr>
-                <w:sz w:val="17"/>
-              </w:rPr>
-              <w:t>Arquitectura</w:t>
-            </w:r>
-            <w:proofErr w:type="spellEnd"/>
-            <w:r>
-              <w:rPr>
-                <w:sz w:val="17"/>
-              </w:rPr>
-              <w:t xml:space="preserve"> Empresarial</w:t>
+              <w:t>Arquitectura Empresarial</w:t>
             </w:r>
           </w:p>
         </w:tc>
@@ -329,19 +311,11 @@
             <w:tcW w:w="3024" w:type="dxa"/>
           </w:tcPr>
           <w:p>
-            <w:proofErr w:type="spellStart"/>
             <w:r>
               <w:rPr>
                 <w:sz w:val="17"/>
               </w:rPr>
-              <w:t>Archivo</w:t>
-            </w:r>
-            <w:proofErr w:type="spellEnd"/>
-            <w:r>
-              <w:rPr>
-                <w:sz w:val="17"/>
-              </w:rPr>
-              <w:t xml:space="preserve"> Word</w:t>
+              <w:t>Archivo Word</w:t>
             </w:r>
           </w:p>
         </w:tc>
@@ -372,35 +346,7 @@
         <w:rPr>
           <w:lang w:val="es-MX"/>
         </w:rPr>
-        <w:t xml:space="preserve">Nota: este documento Word es una versión formal para distribución. Cuando exista diferencia entre Word y </w:t>
-      </w:r>
-      <w:proofErr w:type="spellStart"/>
-      <w:r>
-        <w:rPr>
-          <w:lang w:val="es-MX"/>
-        </w:rPr>
-        <w:t>Markdown</w:t>
-      </w:r>
-      <w:proofErr w:type="spellEnd"/>
-      <w:r>
-        <w:rPr>
-          <w:lang w:val="es-MX"/>
-        </w:rPr>
-        <w:t xml:space="preserve">, prevalece el ADR en </w:t>
-      </w:r>
-      <w:proofErr w:type="spellStart"/>
-      <w:r>
-        <w:rPr>
-          <w:lang w:val="es-MX"/>
-        </w:rPr>
-        <w:t>Markdown</w:t>
-      </w:r>
-      <w:proofErr w:type="spellEnd"/>
-      <w:r>
-        <w:rPr>
-          <w:lang w:val="es-MX"/>
-        </w:rPr>
-        <w:t>.</w:t>
+        <w:t>Nota: este documento Word es una versión formal para distribución. Cuando exista diferencia entre Word y Markdown, prevalece el ADR en Markdown.</w:t>
       </w:r>
     </w:p>
     <w:p>
@@ -575,35 +521,7 @@
         <w:rPr>
           <w:lang w:val="es-MX"/>
         </w:rPr>
-        <w:t xml:space="preserve">Se debe de tener una herramienta para registro de decisiones arquitectónicas. Se propone </w:t>
-      </w:r>
-      <w:proofErr w:type="spellStart"/>
-      <w:r>
-        <w:rPr>
-          <w:lang w:val="es-MX"/>
-        </w:rPr>
-        <w:t>Github</w:t>
-      </w:r>
-      <w:proofErr w:type="spellEnd"/>
-      <w:r>
-        <w:rPr>
-          <w:lang w:val="es-MX"/>
-        </w:rPr>
-        <w:t xml:space="preserve"> y el uso de herramientas Git para poder gestionar diferentes versiones de una decisión y que se </w:t>
-      </w:r>
-      <w:proofErr w:type="spellStart"/>
-      <w:r>
-        <w:rPr>
-          <w:lang w:val="es-MX"/>
-        </w:rPr>
-        <w:t>evaluén</w:t>
-      </w:r>
-      <w:proofErr w:type="spellEnd"/>
-      <w:r>
-        <w:rPr>
-          <w:lang w:val="es-MX"/>
-        </w:rPr>
-        <w:t xml:space="preserve"> de manera independiente.</w:t>
+        <w:t>Se debe de tener una herramienta para registro de decisiones arquitectónicas. Se propone Github y el uso de herramientas Git para poder gestionar diferentes versiones de una decisión y que se evaluén de manera independiente.</w:t>
       </w:r>
     </w:p>
     <w:p>
@@ -1022,97 +940,7 @@
                 <w:szCs w:val="18"/>
                 <w:lang w:val="es-MX"/>
               </w:rPr>
-              <w:t xml:space="preserve">La interfaz </w:t>
-            </w:r>
-            <w:proofErr w:type="spellStart"/>
-            <w:r>
-              <w:rPr>
-                <w:sz w:val="16"/>
-                <w:szCs w:val="18"/>
-                <w:lang w:val="es-MX"/>
-              </w:rPr>
-              <w:t>GitKraken</w:t>
-            </w:r>
-            <w:proofErr w:type="spellEnd"/>
-            <w:r>
-              <w:rPr>
-                <w:sz w:val="16"/>
-                <w:szCs w:val="18"/>
-                <w:lang w:val="es-MX"/>
-              </w:rPr>
-              <w:t xml:space="preserve"> y </w:t>
-            </w:r>
-            <w:proofErr w:type="spellStart"/>
-            <w:r>
-              <w:rPr>
-                <w:sz w:val="16"/>
-                <w:szCs w:val="18"/>
-                <w:lang w:val="es-MX"/>
-              </w:rPr>
-              <w:t>GitBash</w:t>
-            </w:r>
-            <w:proofErr w:type="spellEnd"/>
-            <w:r>
-              <w:rPr>
-                <w:sz w:val="16"/>
-                <w:szCs w:val="18"/>
-                <w:lang w:val="es-MX"/>
-              </w:rPr>
-              <w:t xml:space="preserve"> serán usadas para interactuar con el </w:t>
-            </w:r>
-            <w:proofErr w:type="spellStart"/>
-            <w:r>
-              <w:rPr>
-                <w:sz w:val="16"/>
-                <w:szCs w:val="18"/>
-                <w:lang w:val="es-MX"/>
-              </w:rPr>
-              <w:t>respositorio</w:t>
-            </w:r>
-            <w:proofErr w:type="spellEnd"/>
-            <w:r>
-              <w:rPr>
-                <w:sz w:val="16"/>
-                <w:szCs w:val="18"/>
-                <w:lang w:val="es-MX"/>
-              </w:rPr>
-              <w:t>. La versión gráfica (</w:t>
-            </w:r>
-            <w:proofErr w:type="spellStart"/>
-            <w:r>
-              <w:rPr>
-                <w:sz w:val="16"/>
-                <w:szCs w:val="18"/>
-                <w:lang w:val="es-MX"/>
-              </w:rPr>
-              <w:t>GitKraken</w:t>
-            </w:r>
-            <w:proofErr w:type="spellEnd"/>
-            <w:r>
-              <w:rPr>
-                <w:sz w:val="16"/>
-                <w:szCs w:val="18"/>
-                <w:lang w:val="es-MX"/>
-              </w:rPr>
-              <w:t xml:space="preserve">) será usada por personas menos técnicas, mientras que </w:t>
-            </w:r>
-            <w:proofErr w:type="spellStart"/>
-            <w:r>
-              <w:rPr>
-                <w:sz w:val="16"/>
-                <w:szCs w:val="18"/>
-                <w:lang w:val="es-MX"/>
-              </w:rPr>
-              <w:t>GitBash</w:t>
-            </w:r>
-            <w:proofErr w:type="spellEnd"/>
-            <w:r>
-              <w:rPr>
-                <w:sz w:val="16"/>
-                <w:szCs w:val="18"/>
-                <w:lang w:val="es-MX"/>
-              </w:rPr>
-              <w:t xml:space="preserve"> será usada para automatización.</w:t>
+              <w:t>La interfaz GitKraken y GitBash serán usadas para interactuar con el respositorio. La versión gráfica (GitKraken) será usada por personas menos técnicas, mientras que GitBash será usada para automatización.</w:t>
             </w:r>
           </w:p>
         </w:tc>
@@ -1132,25 +960,7 @@
                 <w:szCs w:val="18"/>
                 <w:lang w:val="es-MX"/>
               </w:rPr>
-              <w:t xml:space="preserve">Servirá de interfaz con el </w:t>
-            </w:r>
-            <w:proofErr w:type="spellStart"/>
-            <w:r>
-              <w:rPr>
-                <w:sz w:val="16"/>
-                <w:szCs w:val="18"/>
-                <w:lang w:val="es-MX"/>
-              </w:rPr>
-              <w:t>respositorio</w:t>
-            </w:r>
-            <w:proofErr w:type="spellEnd"/>
-            <w:r>
-              <w:rPr>
-                <w:sz w:val="16"/>
-                <w:szCs w:val="18"/>
-                <w:lang w:val="es-MX"/>
-              </w:rPr>
-              <w:t xml:space="preserve"> para personas que tengan un rol requerido.</w:t>
+              <w:t>Servirá de interfaz con el respositorio para personas que tengan un rol requerido.</w:t>
             </w:r>
           </w:p>
         </w:tc>
@@ -1460,17 +1270,8 @@
                 <w:sz w:val="16"/>
                 <w:szCs w:val="18"/>
               </w:rPr>
-              <w:t xml:space="preserve">Sin </w:t>
-            </w:r>
-            <w:proofErr w:type="spellStart"/>
-            <w:r>
-              <w:rPr>
-                <w:sz w:val="16"/>
-                <w:szCs w:val="18"/>
-              </w:rPr>
-              <w:t>impacto</w:t>
-            </w:r>
-            <w:proofErr w:type="spellEnd"/>
+              <w:t>Sin impacto</w:t>
+            </w:r>
           </w:p>
         </w:tc>
         <w:tc>
@@ -1529,25 +1330,7 @@
                 <w:szCs w:val="18"/>
                 <w:lang w:val="es-MX"/>
               </w:rPr>
-              <w:t xml:space="preserve">Cuando se implemente funcionalidades de YAML, se implementará </w:t>
-            </w:r>
-            <w:proofErr w:type="spellStart"/>
-            <w:r>
-              <w:rPr>
-                <w:sz w:val="16"/>
-                <w:szCs w:val="18"/>
-                <w:lang w:val="es-MX"/>
-              </w:rPr>
-              <w:t>bitacora</w:t>
-            </w:r>
-            <w:proofErr w:type="spellEnd"/>
-            <w:r>
-              <w:rPr>
-                <w:sz w:val="16"/>
-                <w:szCs w:val="18"/>
-                <w:lang w:val="es-MX"/>
-              </w:rPr>
-              <w:t xml:space="preserve"> y validación vía contrato de datos</w:t>
+              <w:t>Cuando se implemente funcionalidades de YAML, se implementará bitacora y validación vía contrato de datos</w:t>
             </w:r>
           </w:p>
         </w:tc>
@@ -1569,18 +1352,8 @@
                 <w:szCs w:val="18"/>
                 <w:lang w:val="es-MX"/>
               </w:rPr>
-              <w:t xml:space="preserve">Herramienta de control de contratos de datos y de </w:t>
-            </w:r>
-            <w:proofErr w:type="spellStart"/>
-            <w:r>
-              <w:rPr>
-                <w:sz w:val="16"/>
-                <w:szCs w:val="18"/>
-                <w:lang w:val="es-MX"/>
-              </w:rPr>
-              <w:t>versionamiento</w:t>
-            </w:r>
-            <w:proofErr w:type="spellEnd"/>
+              <w:t>Herramienta de control de contratos de datos y de versionamiento</w:t>
+            </w:r>
           </w:p>
         </w:tc>
       </w:tr>
@@ -1617,17 +1390,8 @@
                 <w:sz w:val="16"/>
                 <w:szCs w:val="18"/>
               </w:rPr>
-              <w:t xml:space="preserve">Sin </w:t>
-            </w:r>
-            <w:proofErr w:type="spellStart"/>
-            <w:r>
-              <w:rPr>
-                <w:sz w:val="16"/>
-                <w:szCs w:val="18"/>
-              </w:rPr>
-              <w:t>impacto</w:t>
-            </w:r>
-            <w:proofErr w:type="spellEnd"/>
+              <w:t>Sin impacto</w:t>
+            </w:r>
           </w:p>
         </w:tc>
         <w:tc>
@@ -1766,23 +1530,7 @@
                 <w:sz w:val="17"/>
                 <w:lang w:val="es-MX"/>
               </w:rPr>
-              <w:t xml:space="preserve">¿Qué </w:t>
-            </w:r>
-            <w:proofErr w:type="gramStart"/>
-            <w:r>
-              <w:rPr>
-                <w:sz w:val="17"/>
-                <w:lang w:val="es-MX"/>
-              </w:rPr>
-              <w:t>comportamiento habilita</w:t>
-            </w:r>
-            <w:proofErr w:type="gramEnd"/>
-            <w:r>
-              <w:rPr>
-                <w:sz w:val="17"/>
-                <w:lang w:val="es-MX"/>
-              </w:rPr>
-              <w:t>, restringe o modifica la decisión?</w:t>
+              <w:t>¿Qué comportamiento habilita, restringe o modifica la decisión?</w:t>
             </w:r>
           </w:p>
         </w:tc>
@@ -1818,14 +1566,12 @@
             <w:tcW w:w="1800" w:type="dxa"/>
           </w:tcPr>
           <w:p>
-            <w:proofErr w:type="spellStart"/>
             <w:r>
               <w:rPr>
                 <w:sz w:val="17"/>
               </w:rPr>
               <w:t>Económica</w:t>
             </w:r>
-            <w:proofErr w:type="spellEnd"/>
           </w:p>
         </w:tc>
         <w:tc>
@@ -1879,14 +1625,12 @@
             <w:tcW w:w="1800" w:type="dxa"/>
           </w:tcPr>
           <w:p>
-            <w:proofErr w:type="spellStart"/>
             <w:r>
               <w:rPr>
                 <w:sz w:val="17"/>
               </w:rPr>
               <w:t>Logística</w:t>
             </w:r>
-            <w:proofErr w:type="spellEnd"/>
           </w:p>
         </w:tc>
         <w:tc>
@@ -1960,37 +1704,8 @@
         </w:rPr>
         <w:t xml:space="preserve">Las decisiones arquitectónicas no necesariamente eliminan riesgos. </w:t>
       </w:r>
-      <w:proofErr w:type="spellStart"/>
       <w:r>
-        <w:t>Pueden</w:t>
-      </w:r>
-      <w:proofErr w:type="spellEnd"/>
-      <w:r>
-        <w:t xml:space="preserve"> </w:t>
-      </w:r>
-      <w:proofErr w:type="spellStart"/>
-      <w:r>
-        <w:t>reducirlos</w:t>
-      </w:r>
-      <w:proofErr w:type="spellEnd"/>
-      <w:r>
-        <w:t xml:space="preserve">, </w:t>
-      </w:r>
-      <w:proofErr w:type="spellStart"/>
-      <w:r>
-        <w:t>reposicionarlos</w:t>
-      </w:r>
-      <w:proofErr w:type="spellEnd"/>
-      <w:r>
-        <w:t xml:space="preserve">, </w:t>
-      </w:r>
-      <w:proofErr w:type="spellStart"/>
-      <w:r>
-        <w:t>controlarlos</w:t>
-      </w:r>
-      <w:proofErr w:type="spellEnd"/>
-      <w:r>
-        <w:t>, aceptarlos, transferirlos, introducirlos o escalarlos.</w:t>
+        <w:t>Pueden reducirlos, reposicionarlos, controlarlos, aceptarlos, transferirlos, introducirlos o escalarlos.</w:t>
       </w:r>
     </w:p>
     <w:tbl>
@@ -2158,7 +1873,6 @@
                 <w:lang w:val="es-MX"/>
               </w:rPr>
             </w:pPr>
-            <w:proofErr w:type="spellStart"/>
             <w:r>
               <w:rPr>
                 <w:sz w:val="16"/>
@@ -2166,7 +1880,6 @@
               </w:rPr>
               <w:t>Controlar</w:t>
             </w:r>
-            <w:proofErr w:type="spellEnd"/>
           </w:p>
         </w:tc>
         <w:tc>
@@ -2361,31 +2074,13 @@
                 <w:szCs w:val="18"/>
               </w:rPr>
             </w:pPr>
-            <w:proofErr w:type="spellStart"/>
-            <w:r>
-              <w:rPr>
-                <w:sz w:val="16"/>
-                <w:szCs w:val="18"/>
-              </w:rPr>
-              <w:t>Controlar</w:t>
-            </w:r>
-            <w:proofErr w:type="spellEnd"/>
-            <w:r>
-              <w:rPr>
-                <w:sz w:val="16"/>
-                <w:szCs w:val="18"/>
-              </w:rPr>
-              <w:t xml:space="preserve"> / </w:t>
-            </w:r>
-            <w:proofErr w:type="spellStart"/>
-            <w:r>
-              <w:rPr>
-                <w:sz w:val="16"/>
-                <w:szCs w:val="18"/>
-              </w:rPr>
-              <w:t>Reducir</w:t>
-            </w:r>
-            <w:proofErr w:type="spellEnd"/>
+            <w:r>
+              <w:rPr>
+                <w:sz w:val="16"/>
+                <w:szCs w:val="18"/>
+              </w:rPr>
+              <w:t>Controlar / Reducir</w:t>
+            </w:r>
           </w:p>
         </w:tc>
         <w:tc>
@@ -2545,6 +2240,13 @@
                 <w:szCs w:val="18"/>
               </w:rPr>
             </w:pPr>
+            <w:r>
+              <w:rPr>
+                <w:sz w:val="16"/>
+                <w:szCs w:val="18"/>
+              </w:rPr>
+              <w:t>003-PRV-GOB</w:t>
+            </w:r>
           </w:p>
         </w:tc>
         <w:tc>
@@ -2559,6 +2261,14 @@
                 <w:lang w:val="es-MX"/>
               </w:rPr>
             </w:pPr>
+            <w:r>
+              <w:rPr>
+                <w:sz w:val="16"/>
+                <w:szCs w:val="18"/>
+                <w:lang w:val="es-MX"/>
+              </w:rPr>
+              <w:t>Dependencia del proceso del proveedor para documentar correctamente</w:t>
+            </w:r>
           </w:p>
         </w:tc>
         <w:tc>
@@ -2570,8 +2280,17 @@
               <w:rPr>
                 <w:sz w:val="16"/>
                 <w:szCs w:val="18"/>
+                <w:lang w:val="es-MX"/>
               </w:rPr>
             </w:pPr>
+            <w:r>
+              <w:rPr>
+                <w:sz w:val="16"/>
+                <w:szCs w:val="18"/>
+                <w:lang w:val="es-MX"/>
+              </w:rPr>
+              <w:t>Controlar</w:t>
+            </w:r>
           </w:p>
         </w:tc>
         <w:tc>
@@ -2586,6 +2305,392 @@
                 <w:lang w:val="es-MX"/>
               </w:rPr>
             </w:pPr>
+            <w:r>
+              <w:rPr>
+                <w:sz w:val="16"/>
+                <w:szCs w:val="18"/>
+                <w:lang w:val="es-MX"/>
+              </w:rPr>
+              <w:t>El ADR-0001 controla este riesgo al definir un repositorio interno donde la organización conserva la trazabilidad de sus propias decisiones arquitectónicas. Aunque el proveedor siga generando documentación técnica, las decisiones relevantes quedan registradas bajo una estructura controlada por arquitectura, reduciendo la dependencia del proceso documental del tercero.</w:t>
+            </w:r>
+          </w:p>
+        </w:tc>
+      </w:tr>
+      <w:tr>
+        <w:trPr>
+          <w:jc w:val="center"/>
+        </w:trPr>
+        <w:tc>
+          <w:tcPr>
+            <w:tcW w:w="1296" w:type="dxa"/>
+          </w:tcPr>
+          <w:p>
+            <w:pPr>
+              <w:rPr>
+                <w:sz w:val="16"/>
+                <w:szCs w:val="18"/>
+              </w:rPr>
+            </w:pPr>
+            <w:r>
+              <w:rPr>
+                <w:sz w:val="16"/>
+                <w:szCs w:val="18"/>
+              </w:rPr>
+              <w:t>004-ARQ-DTE</w:t>
+            </w:r>
+          </w:p>
+        </w:tc>
+        <w:tc>
+          <w:tcPr>
+            <w:tcW w:w="2880" w:type="dxa"/>
+          </w:tcPr>
+          <w:p>
+            <w:pPr>
+              <w:rPr>
+                <w:sz w:val="16"/>
+                <w:szCs w:val="18"/>
+                <w:lang w:val="es-MX"/>
+              </w:rPr>
+            </w:pPr>
+            <w:r>
+              <w:rPr>
+                <w:sz w:val="16"/>
+                <w:szCs w:val="18"/>
+                <w:lang w:val="es-MX"/>
+              </w:rPr>
+              <w:t>Incremento de deuda técnica por falta de diseño integral formal</w:t>
+            </w:r>
+          </w:p>
+        </w:tc>
+        <w:tc>
+          <w:tcPr>
+            <w:tcW w:w="2736" w:type="dxa"/>
+          </w:tcPr>
+          <w:p>
+            <w:pPr>
+              <w:rPr>
+                <w:sz w:val="16"/>
+                <w:szCs w:val="18"/>
+                <w:lang w:val="es-MX"/>
+              </w:rPr>
+            </w:pPr>
+            <w:r>
+              <w:rPr>
+                <w:sz w:val="16"/>
+                <w:szCs w:val="18"/>
+                <w:lang w:val="es-MX"/>
+              </w:rPr>
+              <w:t>Reducir / Controlar</w:t>
+            </w:r>
+          </w:p>
+        </w:tc>
+        <w:tc>
+          <w:tcPr>
+            <w:tcW w:w="2664" w:type="dxa"/>
+          </w:tcPr>
+          <w:p>
+            <w:pPr>
+              <w:rPr>
+                <w:sz w:val="16"/>
+                <w:szCs w:val="18"/>
+                <w:lang w:val="es-MX"/>
+              </w:rPr>
+            </w:pPr>
+            <w:r>
+              <w:rPr>
+                <w:sz w:val="16"/>
+                <w:szCs w:val="18"/>
+                <w:lang w:val="es-MX"/>
+              </w:rPr>
+              <w:t>El ADR-0001 reduce este riesgo al obligar a documentar decisiones, alternativas, consecuencias y riesgos residuales antes de que queden absorbidos como cambios aislados o parches técnicos. El RDA no elimina la deuda técnica, pero permite identificar cuándo una decisión la genera, la acepta o la reduce, facilitando su seguimiento.</w:t>
+            </w:r>
+          </w:p>
+        </w:tc>
+      </w:tr>
+      <w:tr>
+        <w:trPr>
+          <w:jc w:val="center"/>
+        </w:trPr>
+        <w:tc>
+          <w:tcPr>
+            <w:tcW w:w="1296" w:type="dxa"/>
+          </w:tcPr>
+          <w:p>
+            <w:pPr>
+              <w:rPr>
+                <w:sz w:val="16"/>
+                <w:szCs w:val="18"/>
+                <w:lang w:val="es-MX"/>
+              </w:rPr>
+            </w:pPr>
+            <w:r>
+              <w:rPr>
+                <w:sz w:val="16"/>
+                <w:szCs w:val="18"/>
+                <w:lang w:val="es-MX"/>
+              </w:rPr>
+              <w:t>005-GOB-TRA</w:t>
+            </w:r>
+          </w:p>
+        </w:tc>
+        <w:tc>
+          <w:tcPr>
+            <w:tcW w:w="2880" w:type="dxa"/>
+          </w:tcPr>
+          <w:p>
+            <w:pPr>
+              <w:rPr>
+                <w:sz w:val="16"/>
+                <w:szCs w:val="18"/>
+                <w:lang w:val="es-MX"/>
+              </w:rPr>
+            </w:pPr>
+            <w:r>
+              <w:rPr>
+                <w:sz w:val="16"/>
+                <w:szCs w:val="18"/>
+                <w:lang w:val="es-MX"/>
+              </w:rPr>
+              <w:t>Pérdida de trazabilidad entre requerimiento y solución</w:t>
+            </w:r>
+          </w:p>
+        </w:tc>
+        <w:tc>
+          <w:tcPr>
+            <w:tcW w:w="2736" w:type="dxa"/>
+          </w:tcPr>
+          <w:p>
+            <w:pPr>
+              <w:rPr>
+                <w:sz w:val="16"/>
+                <w:szCs w:val="18"/>
+                <w:lang w:val="es-MX"/>
+              </w:rPr>
+            </w:pPr>
+            <w:r>
+              <w:rPr>
+                <w:sz w:val="16"/>
+                <w:szCs w:val="18"/>
+                <w:lang w:val="es-MX"/>
+              </w:rPr>
+              <w:t>Controlar</w:t>
+            </w:r>
+          </w:p>
+        </w:tc>
+        <w:tc>
+          <w:tcPr>
+            <w:tcW w:w="2664" w:type="dxa"/>
+          </w:tcPr>
+          <w:p>
+            <w:pPr>
+              <w:rPr>
+                <w:sz w:val="16"/>
+                <w:szCs w:val="18"/>
+                <w:lang w:val="es-MX"/>
+              </w:rPr>
+            </w:pPr>
+            <w:r>
+              <w:rPr>
+                <w:sz w:val="16"/>
+                <w:szCs w:val="18"/>
+                <w:lang w:val="es-MX"/>
+              </w:rPr>
+              <w:t>El ADR-0001 controla este riesgo al vincular cada decisión arquitectónica con su contexto, necesidad, riesgos relacionados, controles y artefactos asociados. Esto permite reconstruir por qué se tomó una decisión y cómo se conecta con la solución, evitando que la relación entre requerimiento, diseño e implementación quede implícita o dispersa.</w:t>
+            </w:r>
+          </w:p>
+        </w:tc>
+      </w:tr>
+      <w:tr>
+        <w:trPr>
+          <w:jc w:val="center"/>
+        </w:trPr>
+        <w:tc>
+          <w:tcPr>
+            <w:tcW w:w="1296" w:type="dxa"/>
+          </w:tcPr>
+          <w:p>
+            <w:pPr>
+              <w:rPr>
+                <w:sz w:val="16"/>
+                <w:szCs w:val="18"/>
+                <w:lang w:val="es-MX"/>
+              </w:rPr>
+            </w:pPr>
+            <w:r>
+              <w:rPr>
+                <w:sz w:val="16"/>
+                <w:szCs w:val="18"/>
+                <w:lang w:val="es-MX"/>
+              </w:rPr>
+              <w:t>014-PRV-GOB</w:t>
+            </w:r>
+          </w:p>
+        </w:tc>
+        <w:tc>
+          <w:tcPr>
+            <w:tcW w:w="2880" w:type="dxa"/>
+          </w:tcPr>
+          <w:p>
+            <w:pPr>
+              <w:rPr>
+                <w:sz w:val="16"/>
+                <w:szCs w:val="18"/>
+                <w:lang w:val="es-MX"/>
+              </w:rPr>
+            </w:pPr>
+            <w:r>
+              <w:rPr>
+                <w:sz w:val="16"/>
+                <w:szCs w:val="18"/>
+                <w:lang w:val="es-MX"/>
+              </w:rPr>
+              <w:t>Dependencia futura de conocimiento tácito de personas o equipos</w:t>
+            </w:r>
+          </w:p>
+        </w:tc>
+        <w:tc>
+          <w:tcPr>
+            <w:tcW w:w="2736" w:type="dxa"/>
+          </w:tcPr>
+          <w:p>
+            <w:pPr>
+              <w:rPr>
+                <w:sz w:val="16"/>
+                <w:szCs w:val="18"/>
+                <w:lang w:val="es-MX"/>
+              </w:rPr>
+            </w:pPr>
+            <w:r>
+              <w:rPr>
+                <w:sz w:val="16"/>
+                <w:szCs w:val="18"/>
+                <w:lang w:val="es-MX"/>
+              </w:rPr>
+              <w:t>Reducir / Controlar</w:t>
+            </w:r>
+          </w:p>
+        </w:tc>
+        <w:tc>
+          <w:tcPr>
+            <w:tcW w:w="2664" w:type="dxa"/>
+          </w:tcPr>
+          <w:p>
+            <w:pPr>
+              <w:rPr>
+                <w:sz w:val="16"/>
+                <w:szCs w:val="18"/>
+                <w:lang w:val="es-MX"/>
+              </w:rPr>
+            </w:pPr>
+            <w:r>
+              <w:rPr>
+                <w:sz w:val="16"/>
+                <w:szCs w:val="18"/>
+                <w:lang w:val="es-MX"/>
+              </w:rPr>
+              <w:t>El ADR-0001 reduce este riesgo al convertir decisiones, responsables, justificaciones y consecuencias en documentación explícita y versionada. Aunque siempre puede existir conocimiento operativo no documentado, el RDA disminuye la dependencia de individuos específicos al dejar evidencia formal de las decisiones arquitectónicas clave.</w:t>
+            </w:r>
+          </w:p>
+        </w:tc>
+      </w:tr>
+      <w:tr>
+        <w:trPr>
+          <w:jc w:val="center"/>
+        </w:trPr>
+        <w:tc>
+          <w:tcPr>
+            <w:tcW w:w="1296" w:type="dxa"/>
+          </w:tcPr>
+          <w:p>
+            <w:pPr>
+              <w:rPr>
+                <w:sz w:val="16"/>
+                <w:szCs w:val="18"/>
+                <w:lang w:val="es-MX"/>
+              </w:rPr>
+            </w:pPr>
+            <w:r>
+              <w:rPr>
+                <w:sz w:val="16"/>
+                <w:szCs w:val="18"/>
+                <w:lang w:val="es-MX"/>
+              </w:rPr>
+              <w:t>031-PRV-TAC</w:t>
+            </w:r>
+          </w:p>
+        </w:tc>
+        <w:tc>
+          <w:tcPr>
+            <w:tcW w:w="2880" w:type="dxa"/>
+          </w:tcPr>
+          <w:p>
+            <w:pPr>
+              <w:rPr>
+                <w:sz w:val="16"/>
+                <w:szCs w:val="18"/>
+                <w:lang w:val="es-MX"/>
+              </w:rPr>
+            </w:pPr>
+            <w:r>
+              <w:rPr>
+                <w:sz w:val="16"/>
+                <w:szCs w:val="18"/>
+              </w:rPr>
+              <w:t>Dependencia de conocimiento tácito</w:t>
+            </w:r>
+          </w:p>
+        </w:tc>
+        <w:tc>
+          <w:tcPr>
+            <w:tcW w:w="2736" w:type="dxa"/>
+          </w:tcPr>
+          <w:p>
+            <w:pPr>
+              <w:rPr>
+                <w:sz w:val="16"/>
+                <w:szCs w:val="18"/>
+                <w:lang w:val="es-MX"/>
+              </w:rPr>
+            </w:pPr>
+            <w:r>
+              <w:rPr>
+                <w:sz w:val="16"/>
+                <w:szCs w:val="18"/>
+                <w:lang w:val="es-MX"/>
+              </w:rPr>
+              <w:t>Reducir/Controlar</w:t>
+            </w:r>
+          </w:p>
+        </w:tc>
+        <w:tc>
+          <w:tcPr>
+            <w:tcW w:w="2664" w:type="dxa"/>
+          </w:tcPr>
+          <w:p>
+            <w:pPr>
+              <w:rPr>
+                <w:sz w:val="16"/>
+                <w:szCs w:val="18"/>
+                <w:lang w:val="es-MX"/>
+              </w:rPr>
+            </w:pPr>
+            <w:r>
+              <w:rPr>
+                <w:sz w:val="16"/>
+                <w:szCs w:val="18"/>
+                <w:lang w:val="es-MX"/>
+              </w:rPr>
+              <w:t xml:space="preserve">El ADR-0001 reduce este riesgo al establecer que las reglas, criterios, decisiones y responsables relevantes deben quedar documentados en una estructura gobernada. Esto evita que la interpretación arquitectónica dependa únicamente de correos, </w:t>
+            </w:r>
+            <w:r>
+              <w:rPr>
+                <w:sz w:val="16"/>
+                <w:szCs w:val="18"/>
+                <w:lang w:val="es-MX"/>
+              </w:rPr>
+              <w:lastRenderedPageBreak/>
+              <w:t>conversaciones, archivos externos o experiencia del proveedor/equipo interno.</w:t>
+            </w:r>
           </w:p>
         </w:tc>
       </w:tr>
@@ -2699,7 +2804,7 @@
                 <w:sz w:val="17"/>
                 <w:lang w:val="es-MX"/>
               </w:rPr>
-              <w:t>¿Dónde estaba posicionado el riesgo antes de esta decisión?</w:t>
+              <w:t>El riesgo quedaba dentro de las capas Core, Satélite, Seguridad, Datos y de interacción.</w:t>
             </w:r>
           </w:p>
         </w:tc>
@@ -2742,7 +2847,7 @@
                 <w:sz w:val="17"/>
                 <w:lang w:val="es-MX"/>
               </w:rPr>
-              <w:t>¿Dónde queda posicionado el riesgo después de esta decisión?</w:t>
+              <w:t>Riesgo queda posicionado dentro de la capa de gobierno.</w:t>
             </w:r>
           </w:p>
         </w:tc>
@@ -2779,23 +2884,7 @@
                 <w:sz w:val="17"/>
                 <w:lang w:val="es-MX"/>
               </w:rPr>
-              <w:t xml:space="preserve">¿Qué riesgo permanece </w:t>
-            </w:r>
-            <w:proofErr w:type="spellStart"/>
-            <w:r>
-              <w:rPr>
-                <w:sz w:val="17"/>
-                <w:lang w:val="es-MX"/>
-              </w:rPr>
-              <w:t>aun</w:t>
-            </w:r>
-            <w:proofErr w:type="spellEnd"/>
-            <w:r>
-              <w:rPr>
-                <w:sz w:val="17"/>
-                <w:lang w:val="es-MX"/>
-              </w:rPr>
-              <w:t xml:space="preserve"> después de aceptar esta decisión?</w:t>
+              <w:t>Persiste el riesgo de que algunos equipos tomen decisiones fuera del RDA o que existan documentos derivados no sincronizados con la fuente oficial.</w:t>
             </w:r>
           </w:p>
         </w:tc>
@@ -2932,11 +3021,18 @@
             <w:tcW w:w="1296" w:type="dxa"/>
           </w:tcPr>
           <w:p>
-            <w:r>
-              <w:rPr>
-                <w:sz w:val="17"/>
-              </w:rPr>
-              <w:t>CTRL-0000</w:t>
+            <w:pPr>
+              <w:rPr>
+                <w:sz w:val="16"/>
+                <w:szCs w:val="18"/>
+              </w:rPr>
+            </w:pPr>
+            <w:r>
+              <w:rPr>
+                <w:sz w:val="16"/>
+                <w:szCs w:val="18"/>
+              </w:rPr>
+              <w:t>CTRL-0001</w:t>
             </w:r>
           </w:p>
         </w:tc>
@@ -2944,30 +3040,204 @@
           <w:tcPr>
             <w:tcW w:w="2304" w:type="dxa"/>
           </w:tcPr>
-          <w:p/>
+          <w:p>
+            <w:pPr>
+              <w:rPr>
+                <w:sz w:val="16"/>
+                <w:szCs w:val="18"/>
+                <w:lang w:val="es-MX"/>
+              </w:rPr>
+            </w:pPr>
+            <w:r>
+              <w:rPr>
+                <w:sz w:val="16"/>
+                <w:szCs w:val="18"/>
+                <w:lang w:val="es-MX"/>
+              </w:rPr>
+              <w:t>Mantener el ADR en Markdown como fuente oficial de la decisi</w:t>
+            </w:r>
+            <w:r>
+              <w:rPr>
+                <w:rFonts w:hint="cs"/>
+                <w:sz w:val="16"/>
+                <w:szCs w:val="18"/>
+                <w:lang w:val="es-MX"/>
+              </w:rPr>
+              <w:t>ó</w:t>
+            </w:r>
+            <w:r>
+              <w:rPr>
+                <w:sz w:val="16"/>
+                <w:szCs w:val="18"/>
+                <w:lang w:val="es-MX"/>
+              </w:rPr>
+              <w:t>n</w:t>
+            </w:r>
+          </w:p>
         </w:tc>
         <w:tc>
           <w:tcPr>
             <w:tcW w:w="2232" w:type="dxa"/>
           </w:tcPr>
-          <w:p/>
+          <w:p>
+            <w:pPr>
+              <w:rPr>
+                <w:sz w:val="16"/>
+                <w:szCs w:val="18"/>
+                <w:lang w:val="es-MX"/>
+              </w:rPr>
+            </w:pPr>
+            <w:r>
+              <w:rPr>
+                <w:sz w:val="16"/>
+                <w:szCs w:val="18"/>
+                <w:lang w:val="es-MX"/>
+              </w:rPr>
+              <w:t>Evitar que existan m</w:t>
+            </w:r>
+            <w:r>
+              <w:rPr>
+                <w:rFonts w:hint="cs"/>
+                <w:sz w:val="16"/>
+                <w:szCs w:val="18"/>
+                <w:lang w:val="es-MX"/>
+              </w:rPr>
+              <w:t>ú</w:t>
+            </w:r>
+            <w:r>
+              <w:rPr>
+                <w:sz w:val="16"/>
+                <w:szCs w:val="18"/>
+                <w:lang w:val="es-MX"/>
+              </w:rPr>
+              <w:t>ltiples versiones contradictorias de una decisi</w:t>
+            </w:r>
+            <w:r>
+              <w:rPr>
+                <w:rFonts w:hint="cs"/>
+                <w:sz w:val="16"/>
+                <w:szCs w:val="18"/>
+                <w:lang w:val="es-MX"/>
+              </w:rPr>
+              <w:t>ó</w:t>
+            </w:r>
+            <w:r>
+              <w:rPr>
+                <w:sz w:val="16"/>
+                <w:szCs w:val="18"/>
+                <w:lang w:val="es-MX"/>
+              </w:rPr>
+              <w:t>n arquitect</w:t>
+            </w:r>
+            <w:r>
+              <w:rPr>
+                <w:rFonts w:hint="cs"/>
+                <w:sz w:val="16"/>
+                <w:szCs w:val="18"/>
+                <w:lang w:val="es-MX"/>
+              </w:rPr>
+              <w:t>ó</w:t>
+            </w:r>
+            <w:r>
+              <w:rPr>
+                <w:sz w:val="16"/>
+                <w:szCs w:val="18"/>
+                <w:lang w:val="es-MX"/>
+              </w:rPr>
+              <w:t>nica. Cuando exista una versi</w:t>
+            </w:r>
+            <w:r>
+              <w:rPr>
+                <w:rFonts w:hint="cs"/>
+                <w:sz w:val="16"/>
+                <w:szCs w:val="18"/>
+                <w:lang w:val="es-MX"/>
+              </w:rPr>
+              <w:t>ó</w:t>
+            </w:r>
+            <w:r>
+              <w:rPr>
+                <w:sz w:val="16"/>
+                <w:szCs w:val="18"/>
+                <w:lang w:val="es-MX"/>
+              </w:rPr>
+              <w:t>n Word, Excel o presentaci</w:t>
+            </w:r>
+            <w:r>
+              <w:rPr>
+                <w:rFonts w:hint="cs"/>
+                <w:sz w:val="16"/>
+                <w:szCs w:val="18"/>
+                <w:lang w:val="es-MX"/>
+              </w:rPr>
+              <w:t>ó</w:t>
+            </w:r>
+            <w:r>
+              <w:rPr>
+                <w:sz w:val="16"/>
+                <w:szCs w:val="18"/>
+                <w:lang w:val="es-MX"/>
+              </w:rPr>
+              <w:t>n, el Markdown del ADR debe prevalecer como fuente oficial.</w:t>
+            </w:r>
+          </w:p>
         </w:tc>
         <w:tc>
           <w:tcPr>
             <w:tcW w:w="1800" w:type="dxa"/>
           </w:tcPr>
-          <w:p/>
+          <w:p>
+            <w:pPr>
+              <w:rPr>
+                <w:sz w:val="16"/>
+                <w:szCs w:val="18"/>
+                <w:lang w:val="es-MX"/>
+              </w:rPr>
+            </w:pPr>
+            <w:r>
+              <w:rPr>
+                <w:sz w:val="16"/>
+                <w:szCs w:val="18"/>
+                <w:lang w:val="es-MX"/>
+              </w:rPr>
+              <w:t>Arquitectura Empresarial / Arquitectura de Soluci</w:t>
+            </w:r>
+            <w:r>
+              <w:rPr>
+                <w:rFonts w:hint="cs"/>
+                <w:sz w:val="16"/>
+                <w:szCs w:val="18"/>
+                <w:lang w:val="es-MX"/>
+              </w:rPr>
+              <w:t>ó</w:t>
+            </w:r>
+            <w:r>
+              <w:rPr>
+                <w:sz w:val="16"/>
+                <w:szCs w:val="18"/>
+                <w:lang w:val="es-MX"/>
+              </w:rPr>
+              <w:t>n</w:t>
+            </w:r>
+          </w:p>
         </w:tc>
         <w:tc>
           <w:tcPr>
             <w:tcW w:w="1944" w:type="dxa"/>
           </w:tcPr>
           <w:p>
-            <w:r>
-              <w:rPr>
-                <w:sz w:val="17"/>
-              </w:rPr>
-              <w:t>Pendiente / En curso / Implementado</w:t>
+            <w:pPr>
+              <w:rPr>
+                <w:sz w:val="16"/>
+                <w:szCs w:val="18"/>
+              </w:rPr>
+            </w:pPr>
+            <w:r>
+              <w:rPr>
+                <w:sz w:val="16"/>
+                <w:szCs w:val="18"/>
+              </w:rPr>
+              <w:t>Requerida</w:t>
             </w:r>
           </w:p>
         </w:tc>
@@ -2981,11 +3251,18 @@
             <w:tcW w:w="1296" w:type="dxa"/>
           </w:tcPr>
           <w:p>
-            <w:r>
-              <w:rPr>
-                <w:sz w:val="17"/>
-              </w:rPr>
-              <w:t>CTRL-0000</w:t>
+            <w:pPr>
+              <w:rPr>
+                <w:sz w:val="16"/>
+                <w:szCs w:val="18"/>
+              </w:rPr>
+            </w:pPr>
+            <w:r>
+              <w:rPr>
+                <w:sz w:val="16"/>
+                <w:szCs w:val="18"/>
+              </w:rPr>
+              <w:t>CTRL-0002</w:t>
             </w:r>
           </w:p>
         </w:tc>
@@ -2993,25 +3270,1546 @@
           <w:tcPr>
             <w:tcW w:w="2304" w:type="dxa"/>
           </w:tcPr>
-          <w:p/>
+          <w:p>
+            <w:pPr>
+              <w:rPr>
+                <w:sz w:val="16"/>
+                <w:szCs w:val="18"/>
+                <w:lang w:val="es-MX"/>
+              </w:rPr>
+            </w:pPr>
+            <w:r>
+              <w:rPr>
+                <w:sz w:val="16"/>
+                <w:szCs w:val="18"/>
+                <w:lang w:val="es-MX"/>
+              </w:rPr>
+              <w:t>Registrar cada ADR en el decision-log.xlsx</w:t>
+            </w:r>
+          </w:p>
         </w:tc>
         <w:tc>
           <w:tcPr>
             <w:tcW w:w="2232" w:type="dxa"/>
           </w:tcPr>
-          <w:p/>
+          <w:p>
+            <w:pPr>
+              <w:rPr>
+                <w:sz w:val="16"/>
+                <w:szCs w:val="18"/>
+                <w:lang w:val="es-MX"/>
+              </w:rPr>
+            </w:pPr>
+            <w:r>
+              <w:rPr>
+                <w:sz w:val="16"/>
+                <w:szCs w:val="18"/>
+                <w:lang w:val="es-MX"/>
+              </w:rPr>
+              <w:t>Asegurar que cada decisi</w:t>
+            </w:r>
+            <w:r>
+              <w:rPr>
+                <w:rFonts w:hint="cs"/>
+                <w:sz w:val="16"/>
+                <w:szCs w:val="18"/>
+                <w:lang w:val="es-MX"/>
+              </w:rPr>
+              <w:t>ó</w:t>
+            </w:r>
+            <w:r>
+              <w:rPr>
+                <w:sz w:val="16"/>
+                <w:szCs w:val="18"/>
+                <w:lang w:val="es-MX"/>
+              </w:rPr>
+              <w:t>n pueda ser localizada, filtrada y relacionada con riesgos, controles, responsables, estado y artefactos asociados.</w:t>
+            </w:r>
+          </w:p>
         </w:tc>
         <w:tc>
           <w:tcPr>
             <w:tcW w:w="1800" w:type="dxa"/>
           </w:tcPr>
-          <w:p/>
+          <w:p>
+            <w:pPr>
+              <w:rPr>
+                <w:sz w:val="16"/>
+                <w:szCs w:val="18"/>
+              </w:rPr>
+            </w:pPr>
+            <w:r>
+              <w:rPr>
+                <w:sz w:val="16"/>
+                <w:szCs w:val="18"/>
+              </w:rPr>
+              <w:t>Arquitectura Empresarial</w:t>
+            </w:r>
+          </w:p>
         </w:tc>
         <w:tc>
           <w:tcPr>
             <w:tcW w:w="1944" w:type="dxa"/>
           </w:tcPr>
-          <w:p/>
+          <w:p>
+            <w:pPr>
+              <w:rPr>
+                <w:sz w:val="16"/>
+                <w:szCs w:val="18"/>
+              </w:rPr>
+            </w:pPr>
+            <w:r>
+              <w:rPr>
+                <w:sz w:val="16"/>
+                <w:szCs w:val="18"/>
+              </w:rPr>
+              <w:t>Requerida</w:t>
+            </w:r>
+          </w:p>
+        </w:tc>
+      </w:tr>
+      <w:tr>
+        <w:trPr>
+          <w:jc w:val="center"/>
+        </w:trPr>
+        <w:tc>
+          <w:tcPr>
+            <w:tcW w:w="1296" w:type="dxa"/>
+          </w:tcPr>
+          <w:p>
+            <w:pPr>
+              <w:rPr>
+                <w:sz w:val="16"/>
+                <w:szCs w:val="18"/>
+              </w:rPr>
+            </w:pPr>
+            <w:r>
+              <w:rPr>
+                <w:sz w:val="16"/>
+                <w:szCs w:val="18"/>
+              </w:rPr>
+              <w:t>CTRL-0003</w:t>
+            </w:r>
+          </w:p>
+        </w:tc>
+        <w:tc>
+          <w:tcPr>
+            <w:tcW w:w="2304" w:type="dxa"/>
+          </w:tcPr>
+          <w:p>
+            <w:pPr>
+              <w:rPr>
+                <w:sz w:val="16"/>
+                <w:szCs w:val="18"/>
+                <w:lang w:val="es-MX"/>
+              </w:rPr>
+            </w:pPr>
+            <w:r>
+              <w:rPr>
+                <w:sz w:val="16"/>
+                <w:szCs w:val="18"/>
+                <w:lang w:val="es-MX"/>
+              </w:rPr>
+              <w:t>Relacionar cada ADR con riesgos aplicables</w:t>
+            </w:r>
+          </w:p>
+        </w:tc>
+        <w:tc>
+          <w:tcPr>
+            <w:tcW w:w="2232" w:type="dxa"/>
+          </w:tcPr>
+          <w:p>
+            <w:pPr>
+              <w:rPr>
+                <w:sz w:val="16"/>
+                <w:szCs w:val="18"/>
+                <w:lang w:val="es-MX"/>
+              </w:rPr>
+            </w:pPr>
+            <w:r>
+              <w:rPr>
+                <w:sz w:val="16"/>
+                <w:szCs w:val="18"/>
+                <w:lang w:val="es-MX"/>
+              </w:rPr>
+              <w:t>Mantener trazabilidad entre riesgos identificados y decisiones arquitect</w:t>
+            </w:r>
+            <w:r>
+              <w:rPr>
+                <w:rFonts w:hint="cs"/>
+                <w:sz w:val="16"/>
+                <w:szCs w:val="18"/>
+                <w:lang w:val="es-MX"/>
+              </w:rPr>
+              <w:t>ó</w:t>
+            </w:r>
+            <w:r>
+              <w:rPr>
+                <w:sz w:val="16"/>
+                <w:szCs w:val="18"/>
+                <w:lang w:val="es-MX"/>
+              </w:rPr>
+              <w:t>nicas, permitiendo explicar qu</w:t>
+            </w:r>
+            <w:r>
+              <w:rPr>
+                <w:rFonts w:hint="cs"/>
+                <w:sz w:val="16"/>
+                <w:szCs w:val="18"/>
+                <w:lang w:val="es-MX"/>
+              </w:rPr>
+              <w:t>é</w:t>
+            </w:r>
+            <w:r>
+              <w:rPr>
+                <w:sz w:val="16"/>
+                <w:szCs w:val="18"/>
+                <w:lang w:val="es-MX"/>
+              </w:rPr>
+              <w:t xml:space="preserve"> riesgos son controlados, reducidos, reposicionados, aceptados o introducidos por cada decisi</w:t>
+            </w:r>
+            <w:r>
+              <w:rPr>
+                <w:rFonts w:hint="cs"/>
+                <w:sz w:val="16"/>
+                <w:szCs w:val="18"/>
+                <w:lang w:val="es-MX"/>
+              </w:rPr>
+              <w:t>ó</w:t>
+            </w:r>
+            <w:r>
+              <w:rPr>
+                <w:sz w:val="16"/>
+                <w:szCs w:val="18"/>
+                <w:lang w:val="es-MX"/>
+              </w:rPr>
+              <w:t>n.</w:t>
+            </w:r>
+          </w:p>
+        </w:tc>
+        <w:tc>
+          <w:tcPr>
+            <w:tcW w:w="1800" w:type="dxa"/>
+          </w:tcPr>
+          <w:p>
+            <w:pPr>
+              <w:rPr>
+                <w:sz w:val="16"/>
+                <w:szCs w:val="18"/>
+                <w:lang w:val="es-MX"/>
+              </w:rPr>
+            </w:pPr>
+            <w:r>
+              <w:rPr>
+                <w:sz w:val="16"/>
+                <w:szCs w:val="18"/>
+                <w:lang w:val="es-MX"/>
+              </w:rPr>
+              <w:t>Arquitectura Empresarial / Gesti</w:t>
+            </w:r>
+            <w:r>
+              <w:rPr>
+                <w:rFonts w:hint="cs"/>
+                <w:sz w:val="16"/>
+                <w:szCs w:val="18"/>
+                <w:lang w:val="es-MX"/>
+              </w:rPr>
+              <w:t>ó</w:t>
+            </w:r>
+            <w:r>
+              <w:rPr>
+                <w:sz w:val="16"/>
+                <w:szCs w:val="18"/>
+                <w:lang w:val="es-MX"/>
+              </w:rPr>
+              <w:t>n de Riesgos / Arquitectura de Soluci</w:t>
+            </w:r>
+            <w:r>
+              <w:rPr>
+                <w:rFonts w:hint="cs"/>
+                <w:sz w:val="16"/>
+                <w:szCs w:val="18"/>
+                <w:lang w:val="es-MX"/>
+              </w:rPr>
+              <w:t>ó</w:t>
+            </w:r>
+            <w:r>
+              <w:rPr>
+                <w:sz w:val="16"/>
+                <w:szCs w:val="18"/>
+                <w:lang w:val="es-MX"/>
+              </w:rPr>
+              <w:t>n</w:t>
+            </w:r>
+          </w:p>
+        </w:tc>
+        <w:tc>
+          <w:tcPr>
+            <w:tcW w:w="1944" w:type="dxa"/>
+          </w:tcPr>
+          <w:p>
+            <w:pPr>
+              <w:rPr>
+                <w:sz w:val="16"/>
+                <w:szCs w:val="18"/>
+              </w:rPr>
+            </w:pPr>
+            <w:r>
+              <w:rPr>
+                <w:sz w:val="16"/>
+                <w:szCs w:val="18"/>
+              </w:rPr>
+              <w:t>Requerida</w:t>
+            </w:r>
+          </w:p>
+        </w:tc>
+      </w:tr>
+      <w:tr>
+        <w:trPr>
+          <w:jc w:val="center"/>
+        </w:trPr>
+        <w:tc>
+          <w:tcPr>
+            <w:tcW w:w="1296" w:type="dxa"/>
+          </w:tcPr>
+          <w:p>
+            <w:pPr>
+              <w:rPr>
+                <w:sz w:val="16"/>
+                <w:szCs w:val="18"/>
+              </w:rPr>
+            </w:pPr>
+            <w:r>
+              <w:rPr>
+                <w:sz w:val="16"/>
+                <w:szCs w:val="18"/>
+              </w:rPr>
+              <w:t>CTRL-0004</w:t>
+            </w:r>
+          </w:p>
+        </w:tc>
+        <w:tc>
+          <w:tcPr>
+            <w:tcW w:w="2304" w:type="dxa"/>
+          </w:tcPr>
+          <w:p>
+            <w:pPr>
+              <w:rPr>
+                <w:sz w:val="16"/>
+                <w:szCs w:val="18"/>
+                <w:lang w:val="es-MX"/>
+              </w:rPr>
+            </w:pPr>
+            <w:r>
+              <w:rPr>
+                <w:sz w:val="16"/>
+                <w:szCs w:val="18"/>
+                <w:lang w:val="es-MX"/>
+              </w:rPr>
+              <w:t>Definir estado formal para cada ADR</w:t>
+            </w:r>
+          </w:p>
+        </w:tc>
+        <w:tc>
+          <w:tcPr>
+            <w:tcW w:w="2232" w:type="dxa"/>
+          </w:tcPr>
+          <w:p>
+            <w:pPr>
+              <w:rPr>
+                <w:sz w:val="16"/>
+                <w:szCs w:val="18"/>
+                <w:lang w:val="es-MX"/>
+              </w:rPr>
+            </w:pPr>
+            <w:r>
+              <w:rPr>
+                <w:sz w:val="16"/>
+                <w:szCs w:val="18"/>
+                <w:lang w:val="es-MX"/>
+              </w:rPr>
+              <w:t>Evitar ambig</w:t>
+            </w:r>
+            <w:r>
+              <w:rPr>
+                <w:rFonts w:hint="cs"/>
+                <w:sz w:val="16"/>
+                <w:szCs w:val="18"/>
+                <w:lang w:val="es-MX"/>
+              </w:rPr>
+              <w:t>ü</w:t>
+            </w:r>
+            <w:r>
+              <w:rPr>
+                <w:sz w:val="16"/>
+                <w:szCs w:val="18"/>
+                <w:lang w:val="es-MX"/>
+              </w:rPr>
+              <w:t>edad sobre si una decisi</w:t>
+            </w:r>
+            <w:r>
+              <w:rPr>
+                <w:rFonts w:hint="cs"/>
+                <w:sz w:val="16"/>
+                <w:szCs w:val="18"/>
+                <w:lang w:val="es-MX"/>
+              </w:rPr>
+              <w:t>ó</w:t>
+            </w:r>
+            <w:r>
+              <w:rPr>
+                <w:sz w:val="16"/>
+                <w:szCs w:val="18"/>
+                <w:lang w:val="es-MX"/>
+              </w:rPr>
+              <w:t>n est</w:t>
+            </w:r>
+            <w:r>
+              <w:rPr>
+                <w:rFonts w:hint="cs"/>
+                <w:sz w:val="16"/>
+                <w:szCs w:val="18"/>
+                <w:lang w:val="es-MX"/>
+              </w:rPr>
+              <w:t>á</w:t>
+            </w:r>
+            <w:r>
+              <w:rPr>
+                <w:sz w:val="16"/>
+                <w:szCs w:val="18"/>
+                <w:lang w:val="es-MX"/>
+              </w:rPr>
+              <w:t xml:space="preserve"> propuesta, aceptada, rechazada, en revisi</w:t>
+            </w:r>
+            <w:r>
+              <w:rPr>
+                <w:rFonts w:hint="cs"/>
+                <w:sz w:val="16"/>
+                <w:szCs w:val="18"/>
+                <w:lang w:val="es-MX"/>
+              </w:rPr>
+              <w:t>ó</w:t>
+            </w:r>
+            <w:r>
+              <w:rPr>
+                <w:sz w:val="16"/>
+                <w:szCs w:val="18"/>
+                <w:lang w:val="es-MX"/>
+              </w:rPr>
+              <w:t>n, deprecada o reemplazada.</w:t>
+            </w:r>
+          </w:p>
+        </w:tc>
+        <w:tc>
+          <w:tcPr>
+            <w:tcW w:w="1800" w:type="dxa"/>
+          </w:tcPr>
+          <w:p>
+            <w:pPr>
+              <w:rPr>
+                <w:sz w:val="16"/>
+                <w:szCs w:val="18"/>
+                <w:lang w:val="es-MX"/>
+              </w:rPr>
+            </w:pPr>
+            <w:r>
+              <w:rPr>
+                <w:sz w:val="16"/>
+                <w:szCs w:val="18"/>
+              </w:rPr>
+              <w:t>Arquitectura Empresarial</w:t>
+            </w:r>
+          </w:p>
+        </w:tc>
+        <w:tc>
+          <w:tcPr>
+            <w:tcW w:w="1944" w:type="dxa"/>
+          </w:tcPr>
+          <w:p>
+            <w:pPr>
+              <w:rPr>
+                <w:sz w:val="16"/>
+                <w:szCs w:val="18"/>
+              </w:rPr>
+            </w:pPr>
+            <w:r>
+              <w:rPr>
+                <w:sz w:val="16"/>
+                <w:szCs w:val="18"/>
+              </w:rPr>
+              <w:t>Requerida</w:t>
+            </w:r>
+          </w:p>
+        </w:tc>
+      </w:tr>
+      <w:tr>
+        <w:trPr>
+          <w:jc w:val="center"/>
+        </w:trPr>
+        <w:tc>
+          <w:tcPr>
+            <w:tcW w:w="1296" w:type="dxa"/>
+          </w:tcPr>
+          <w:p>
+            <w:pPr>
+              <w:rPr>
+                <w:sz w:val="16"/>
+                <w:szCs w:val="18"/>
+              </w:rPr>
+            </w:pPr>
+            <w:r>
+              <w:rPr>
+                <w:sz w:val="16"/>
+                <w:szCs w:val="18"/>
+              </w:rPr>
+              <w:t>CTRL-0005</w:t>
+            </w:r>
+          </w:p>
+        </w:tc>
+        <w:tc>
+          <w:tcPr>
+            <w:tcW w:w="2304" w:type="dxa"/>
+          </w:tcPr>
+          <w:p>
+            <w:pPr>
+              <w:rPr>
+                <w:sz w:val="16"/>
+                <w:szCs w:val="18"/>
+                <w:lang w:val="es-MX"/>
+              </w:rPr>
+            </w:pPr>
+            <w:r>
+              <w:rPr>
+                <w:sz w:val="16"/>
+                <w:szCs w:val="18"/>
+                <w:lang w:val="es-MX"/>
+              </w:rPr>
+              <w:t>Mantener versiones Word sincronizadas con el ADR Markdown</w:t>
+            </w:r>
+          </w:p>
+        </w:tc>
+        <w:tc>
+          <w:tcPr>
+            <w:tcW w:w="2232" w:type="dxa"/>
+          </w:tcPr>
+          <w:p>
+            <w:pPr>
+              <w:rPr>
+                <w:sz w:val="16"/>
+                <w:szCs w:val="18"/>
+                <w:lang w:val="es-MX"/>
+              </w:rPr>
+            </w:pPr>
+            <w:r>
+              <w:rPr>
+                <w:sz w:val="16"/>
+                <w:szCs w:val="18"/>
+                <w:lang w:val="es-MX"/>
+              </w:rPr>
+              <w:t>Asegurar que los documentos Word distribuidos a audiencias no t</w:t>
+            </w:r>
+            <w:r>
+              <w:rPr>
+                <w:rFonts w:hint="cs"/>
+                <w:sz w:val="16"/>
+                <w:szCs w:val="18"/>
+                <w:lang w:val="es-MX"/>
+              </w:rPr>
+              <w:t>é</w:t>
+            </w:r>
+            <w:r>
+              <w:rPr>
+                <w:sz w:val="16"/>
+                <w:szCs w:val="18"/>
+                <w:lang w:val="es-MX"/>
+              </w:rPr>
+              <w:t>cnicas no contradigan la fuente oficial del repositorio.</w:t>
+            </w:r>
+          </w:p>
+        </w:tc>
+        <w:tc>
+          <w:tcPr>
+            <w:tcW w:w="1800" w:type="dxa"/>
+          </w:tcPr>
+          <w:p>
+            <w:pPr>
+              <w:rPr>
+                <w:sz w:val="16"/>
+                <w:szCs w:val="18"/>
+              </w:rPr>
+            </w:pPr>
+            <w:r>
+              <w:rPr>
+                <w:sz w:val="16"/>
+                <w:szCs w:val="18"/>
+              </w:rPr>
+              <w:t>Arquitectura Empresarial / Documentaci</w:t>
+            </w:r>
+            <w:r>
+              <w:rPr>
+                <w:rFonts w:hint="cs"/>
+                <w:sz w:val="16"/>
+                <w:szCs w:val="18"/>
+              </w:rPr>
+              <w:t>ó</w:t>
+            </w:r>
+            <w:r>
+              <w:rPr>
+                <w:sz w:val="16"/>
+                <w:szCs w:val="18"/>
+              </w:rPr>
+              <w:t>n / PMO</w:t>
+            </w:r>
+          </w:p>
+        </w:tc>
+        <w:tc>
+          <w:tcPr>
+            <w:tcW w:w="1944" w:type="dxa"/>
+          </w:tcPr>
+          <w:p>
+            <w:pPr>
+              <w:rPr>
+                <w:sz w:val="16"/>
+                <w:szCs w:val="18"/>
+              </w:rPr>
+            </w:pPr>
+            <w:r>
+              <w:rPr>
+                <w:sz w:val="16"/>
+                <w:szCs w:val="18"/>
+              </w:rPr>
+              <w:t>Prioritaria</w:t>
+            </w:r>
+          </w:p>
+        </w:tc>
+      </w:tr>
+      <w:tr>
+        <w:trPr>
+          <w:jc w:val="center"/>
+        </w:trPr>
+        <w:tc>
+          <w:tcPr>
+            <w:tcW w:w="1296" w:type="dxa"/>
+          </w:tcPr>
+          <w:p>
+            <w:pPr>
+              <w:rPr>
+                <w:sz w:val="16"/>
+                <w:szCs w:val="18"/>
+              </w:rPr>
+            </w:pPr>
+            <w:r>
+              <w:rPr>
+                <w:sz w:val="16"/>
+                <w:szCs w:val="18"/>
+              </w:rPr>
+              <w:t>CTRL-0006</w:t>
+            </w:r>
+          </w:p>
+        </w:tc>
+        <w:tc>
+          <w:tcPr>
+            <w:tcW w:w="2304" w:type="dxa"/>
+          </w:tcPr>
+          <w:p>
+            <w:pPr>
+              <w:rPr>
+                <w:sz w:val="16"/>
+                <w:szCs w:val="18"/>
+                <w:lang w:val="es-MX"/>
+              </w:rPr>
+            </w:pPr>
+            <w:r>
+              <w:rPr>
+                <w:sz w:val="16"/>
+                <w:szCs w:val="18"/>
+                <w:lang w:val="es-MX"/>
+              </w:rPr>
+              <w:t>Revisar peri</w:t>
+            </w:r>
+            <w:r>
+              <w:rPr>
+                <w:rFonts w:hint="cs"/>
+                <w:sz w:val="16"/>
+                <w:szCs w:val="18"/>
+                <w:lang w:val="es-MX"/>
+              </w:rPr>
+              <w:t>ó</w:t>
+            </w:r>
+            <w:r>
+              <w:rPr>
+                <w:sz w:val="16"/>
+                <w:szCs w:val="18"/>
+                <w:lang w:val="es-MX"/>
+              </w:rPr>
+              <w:t>dicamente ADRs abiertos o en revisi</w:t>
+            </w:r>
+            <w:r>
+              <w:rPr>
+                <w:rFonts w:hint="cs"/>
+                <w:sz w:val="16"/>
+                <w:szCs w:val="18"/>
+                <w:lang w:val="es-MX"/>
+              </w:rPr>
+              <w:t>ó</w:t>
+            </w:r>
+            <w:r>
+              <w:rPr>
+                <w:sz w:val="16"/>
+                <w:szCs w:val="18"/>
+                <w:lang w:val="es-MX"/>
+              </w:rPr>
+              <w:t>n</w:t>
+            </w:r>
+          </w:p>
+        </w:tc>
+        <w:tc>
+          <w:tcPr>
+            <w:tcW w:w="2232" w:type="dxa"/>
+          </w:tcPr>
+          <w:p>
+            <w:pPr>
+              <w:rPr>
+                <w:sz w:val="16"/>
+                <w:szCs w:val="18"/>
+                <w:lang w:val="es-MX"/>
+              </w:rPr>
+            </w:pPr>
+            <w:r>
+              <w:rPr>
+                <w:sz w:val="16"/>
+                <w:szCs w:val="18"/>
+                <w:lang w:val="es-MX"/>
+              </w:rPr>
+              <w:t>Evitar que decisiones en estado Proposed o Under Review permanezcan indefinidamente sin resoluci</w:t>
+            </w:r>
+            <w:r>
+              <w:rPr>
+                <w:rFonts w:hint="cs"/>
+                <w:sz w:val="16"/>
+                <w:szCs w:val="18"/>
+                <w:lang w:val="es-MX"/>
+              </w:rPr>
+              <w:t>ó</w:t>
+            </w:r>
+            <w:r>
+              <w:rPr>
+                <w:sz w:val="16"/>
+                <w:szCs w:val="18"/>
+                <w:lang w:val="es-MX"/>
+              </w:rPr>
+              <w:t>n.</w:t>
+            </w:r>
+          </w:p>
+        </w:tc>
+        <w:tc>
+          <w:tcPr>
+            <w:tcW w:w="1800" w:type="dxa"/>
+          </w:tcPr>
+          <w:p>
+            <w:pPr>
+              <w:rPr>
+                <w:sz w:val="16"/>
+                <w:szCs w:val="18"/>
+                <w:lang w:val="es-MX"/>
+              </w:rPr>
+            </w:pPr>
+            <w:r>
+              <w:rPr>
+                <w:sz w:val="16"/>
+                <w:szCs w:val="18"/>
+                <w:lang w:val="es-MX"/>
+              </w:rPr>
+              <w:t>Arquitectura Empresarial / Comit</w:t>
+            </w:r>
+            <w:r>
+              <w:rPr>
+                <w:rFonts w:hint="cs"/>
+                <w:sz w:val="16"/>
+                <w:szCs w:val="18"/>
+                <w:lang w:val="es-MX"/>
+              </w:rPr>
+              <w:t>é</w:t>
+            </w:r>
+            <w:r>
+              <w:rPr>
+                <w:sz w:val="16"/>
+                <w:szCs w:val="18"/>
+                <w:lang w:val="es-MX"/>
+              </w:rPr>
+              <w:t xml:space="preserve"> de Arquitectura</w:t>
+            </w:r>
+          </w:p>
+        </w:tc>
+        <w:tc>
+          <w:tcPr>
+            <w:tcW w:w="1944" w:type="dxa"/>
+          </w:tcPr>
+          <w:p>
+            <w:pPr>
+              <w:rPr>
+                <w:sz w:val="16"/>
+                <w:szCs w:val="18"/>
+              </w:rPr>
+            </w:pPr>
+            <w:r>
+              <w:rPr>
+                <w:sz w:val="16"/>
+                <w:szCs w:val="18"/>
+              </w:rPr>
+              <w:t>Prioritaria</w:t>
+            </w:r>
+          </w:p>
+        </w:tc>
+      </w:tr>
+      <w:tr>
+        <w:trPr>
+          <w:jc w:val="center"/>
+        </w:trPr>
+        <w:tc>
+          <w:tcPr>
+            <w:tcW w:w="1296" w:type="dxa"/>
+          </w:tcPr>
+          <w:p>
+            <w:pPr>
+              <w:rPr>
+                <w:sz w:val="16"/>
+                <w:szCs w:val="18"/>
+              </w:rPr>
+            </w:pPr>
+            <w:r>
+              <w:rPr>
+                <w:sz w:val="16"/>
+                <w:szCs w:val="18"/>
+              </w:rPr>
+              <w:t>CTRL-0007</w:t>
+            </w:r>
+          </w:p>
+        </w:tc>
+        <w:tc>
+          <w:tcPr>
+            <w:tcW w:w="2304" w:type="dxa"/>
+          </w:tcPr>
+          <w:p>
+            <w:pPr>
+              <w:rPr>
+                <w:sz w:val="16"/>
+                <w:szCs w:val="18"/>
+                <w:lang w:val="es-MX"/>
+              </w:rPr>
+            </w:pPr>
+            <w:r>
+              <w:rPr>
+                <w:sz w:val="16"/>
+                <w:szCs w:val="18"/>
+                <w:lang w:val="es-MX"/>
+              </w:rPr>
+              <w:t>No documentar decisiones arquitect</w:t>
+            </w:r>
+            <w:r>
+              <w:rPr>
+                <w:rFonts w:hint="cs"/>
+                <w:sz w:val="16"/>
+                <w:szCs w:val="18"/>
+                <w:lang w:val="es-MX"/>
+              </w:rPr>
+              <w:t>ó</w:t>
+            </w:r>
+            <w:r>
+              <w:rPr>
+                <w:sz w:val="16"/>
+                <w:szCs w:val="18"/>
+                <w:lang w:val="es-MX"/>
+              </w:rPr>
+              <w:t xml:space="preserve">nicas </w:t>
+            </w:r>
+            <w:r>
+              <w:rPr>
+                <w:rFonts w:hint="cs"/>
+                <w:sz w:val="16"/>
+                <w:szCs w:val="18"/>
+                <w:lang w:val="es-MX"/>
+              </w:rPr>
+              <w:t>ú</w:t>
+            </w:r>
+            <w:r>
+              <w:rPr>
+                <w:sz w:val="16"/>
+                <w:szCs w:val="18"/>
+                <w:lang w:val="es-MX"/>
+              </w:rPr>
+              <w:t>nicamente en correos, minutas o chats</w:t>
+            </w:r>
+          </w:p>
+        </w:tc>
+        <w:tc>
+          <w:tcPr>
+            <w:tcW w:w="2232" w:type="dxa"/>
+          </w:tcPr>
+          <w:p>
+            <w:pPr>
+              <w:rPr>
+                <w:sz w:val="16"/>
+                <w:szCs w:val="18"/>
+                <w:lang w:val="es-MX"/>
+              </w:rPr>
+            </w:pPr>
+            <w:r>
+              <w:rPr>
+                <w:sz w:val="16"/>
+                <w:szCs w:val="18"/>
+                <w:lang w:val="es-MX"/>
+              </w:rPr>
+              <w:t>Reducir la dependencia de conocimiento t</w:t>
+            </w:r>
+            <w:r>
+              <w:rPr>
+                <w:rFonts w:hint="cs"/>
+                <w:sz w:val="16"/>
+                <w:szCs w:val="18"/>
+                <w:lang w:val="es-MX"/>
+              </w:rPr>
+              <w:t>á</w:t>
+            </w:r>
+            <w:r>
+              <w:rPr>
+                <w:sz w:val="16"/>
+                <w:szCs w:val="18"/>
+                <w:lang w:val="es-MX"/>
+              </w:rPr>
+              <w:t>cito o disperso, obligando a que toda decisi</w:t>
+            </w:r>
+            <w:r>
+              <w:rPr>
+                <w:rFonts w:hint="cs"/>
+                <w:sz w:val="16"/>
+                <w:szCs w:val="18"/>
+                <w:lang w:val="es-MX"/>
+              </w:rPr>
+              <w:t>ó</w:t>
+            </w:r>
+            <w:r>
+              <w:rPr>
+                <w:sz w:val="16"/>
+                <w:szCs w:val="18"/>
+                <w:lang w:val="es-MX"/>
+              </w:rPr>
+              <w:t>n relevante tenga una entrada formal en el RDA.</w:t>
+            </w:r>
+          </w:p>
+        </w:tc>
+        <w:tc>
+          <w:tcPr>
+            <w:tcW w:w="1800" w:type="dxa"/>
+          </w:tcPr>
+          <w:p>
+            <w:pPr>
+              <w:rPr>
+                <w:sz w:val="16"/>
+                <w:szCs w:val="18"/>
+                <w:lang w:val="es-MX"/>
+              </w:rPr>
+            </w:pPr>
+            <w:r>
+              <w:rPr>
+                <w:sz w:val="16"/>
+                <w:szCs w:val="18"/>
+                <w:lang w:val="es-MX"/>
+              </w:rPr>
+              <w:t>Todos los equipos participantes / Arquitectura Empresarial</w:t>
+            </w:r>
+          </w:p>
+        </w:tc>
+        <w:tc>
+          <w:tcPr>
+            <w:tcW w:w="1944" w:type="dxa"/>
+          </w:tcPr>
+          <w:p>
+            <w:pPr>
+              <w:rPr>
+                <w:sz w:val="16"/>
+                <w:szCs w:val="18"/>
+              </w:rPr>
+            </w:pPr>
+            <w:r>
+              <w:rPr>
+                <w:sz w:val="16"/>
+                <w:szCs w:val="18"/>
+              </w:rPr>
+              <w:t>Requerida</w:t>
+            </w:r>
+          </w:p>
+        </w:tc>
+      </w:tr>
+      <w:tr>
+        <w:trPr>
+          <w:jc w:val="center"/>
+        </w:trPr>
+        <w:tc>
+          <w:tcPr>
+            <w:tcW w:w="1296" w:type="dxa"/>
+          </w:tcPr>
+          <w:p>
+            <w:pPr>
+              <w:rPr>
+                <w:sz w:val="16"/>
+                <w:szCs w:val="18"/>
+              </w:rPr>
+            </w:pPr>
+            <w:r>
+              <w:rPr>
+                <w:sz w:val="16"/>
+                <w:szCs w:val="18"/>
+              </w:rPr>
+              <w:t>CTRL-0008</w:t>
+            </w:r>
+          </w:p>
+        </w:tc>
+        <w:tc>
+          <w:tcPr>
+            <w:tcW w:w="2304" w:type="dxa"/>
+          </w:tcPr>
+          <w:p>
+            <w:pPr>
+              <w:rPr>
+                <w:sz w:val="16"/>
+                <w:szCs w:val="18"/>
+                <w:lang w:val="es-MX"/>
+              </w:rPr>
+            </w:pPr>
+            <w:r>
+              <w:rPr>
+                <w:sz w:val="16"/>
+                <w:szCs w:val="18"/>
+                <w:lang w:val="es-MX"/>
+              </w:rPr>
+              <w:t>Usar convenci</w:t>
+            </w:r>
+            <w:r>
+              <w:rPr>
+                <w:rFonts w:hint="cs"/>
+                <w:sz w:val="16"/>
+                <w:szCs w:val="18"/>
+                <w:lang w:val="es-MX"/>
+              </w:rPr>
+              <w:t>ó</w:t>
+            </w:r>
+            <w:r>
+              <w:rPr>
+                <w:sz w:val="16"/>
+                <w:szCs w:val="18"/>
+                <w:lang w:val="es-MX"/>
+              </w:rPr>
+              <w:t xml:space="preserve">n </w:t>
+            </w:r>
+            <w:r>
+              <w:rPr>
+                <w:rFonts w:hint="cs"/>
+                <w:sz w:val="16"/>
+                <w:szCs w:val="18"/>
+                <w:lang w:val="es-MX"/>
+              </w:rPr>
+              <w:t>ú</w:t>
+            </w:r>
+            <w:r>
+              <w:rPr>
+                <w:sz w:val="16"/>
+                <w:szCs w:val="18"/>
+                <w:lang w:val="es-MX"/>
+              </w:rPr>
+              <w:t>nica de nombres e IDs para ADRs</w:t>
+            </w:r>
+          </w:p>
+        </w:tc>
+        <w:tc>
+          <w:tcPr>
+            <w:tcW w:w="2232" w:type="dxa"/>
+          </w:tcPr>
+          <w:p>
+            <w:pPr>
+              <w:rPr>
+                <w:sz w:val="16"/>
+                <w:szCs w:val="18"/>
+                <w:lang w:val="es-MX"/>
+              </w:rPr>
+            </w:pPr>
+            <w:r>
+              <w:rPr>
+                <w:sz w:val="16"/>
+                <w:szCs w:val="18"/>
+                <w:lang w:val="es-MX"/>
+              </w:rPr>
+              <w:t>Evitar duplicidad, p</w:t>
+            </w:r>
+            <w:r>
+              <w:rPr>
+                <w:rFonts w:hint="cs"/>
+                <w:sz w:val="16"/>
+                <w:szCs w:val="18"/>
+                <w:lang w:val="es-MX"/>
+              </w:rPr>
+              <w:t>é</w:t>
+            </w:r>
+            <w:r>
+              <w:rPr>
+                <w:sz w:val="16"/>
+                <w:szCs w:val="18"/>
+                <w:lang w:val="es-MX"/>
+              </w:rPr>
+              <w:t>rdida de trazabilidad o reutilizaci</w:t>
+            </w:r>
+            <w:r>
+              <w:rPr>
+                <w:rFonts w:hint="cs"/>
+                <w:sz w:val="16"/>
+                <w:szCs w:val="18"/>
+                <w:lang w:val="es-MX"/>
+              </w:rPr>
+              <w:t>ó</w:t>
+            </w:r>
+            <w:r>
+              <w:rPr>
+                <w:sz w:val="16"/>
+                <w:szCs w:val="18"/>
+                <w:lang w:val="es-MX"/>
+              </w:rPr>
+              <w:t>n de identificadores en decisiones arquitect</w:t>
+            </w:r>
+            <w:r>
+              <w:rPr>
+                <w:rFonts w:hint="cs"/>
+                <w:sz w:val="16"/>
+                <w:szCs w:val="18"/>
+                <w:lang w:val="es-MX"/>
+              </w:rPr>
+              <w:t>ó</w:t>
+            </w:r>
+            <w:r>
+              <w:rPr>
+                <w:sz w:val="16"/>
+                <w:szCs w:val="18"/>
+                <w:lang w:val="es-MX"/>
+              </w:rPr>
+              <w:t>nicas.</w:t>
+            </w:r>
+          </w:p>
+        </w:tc>
+        <w:tc>
+          <w:tcPr>
+            <w:tcW w:w="1800" w:type="dxa"/>
+          </w:tcPr>
+          <w:p>
+            <w:pPr>
+              <w:rPr>
+                <w:sz w:val="16"/>
+                <w:szCs w:val="18"/>
+                <w:lang w:val="es-MX"/>
+              </w:rPr>
+            </w:pPr>
+            <w:r>
+              <w:rPr>
+                <w:sz w:val="16"/>
+                <w:szCs w:val="18"/>
+              </w:rPr>
+              <w:t>Arquitectura Empresarial</w:t>
+            </w:r>
+          </w:p>
+        </w:tc>
+        <w:tc>
+          <w:tcPr>
+            <w:tcW w:w="1944" w:type="dxa"/>
+          </w:tcPr>
+          <w:p>
+            <w:pPr>
+              <w:rPr>
+                <w:sz w:val="16"/>
+                <w:szCs w:val="18"/>
+              </w:rPr>
+            </w:pPr>
+            <w:r>
+              <w:rPr>
+                <w:sz w:val="16"/>
+                <w:szCs w:val="18"/>
+              </w:rPr>
+              <w:t>Requerida</w:t>
+            </w:r>
+          </w:p>
+        </w:tc>
+      </w:tr>
+      <w:tr>
+        <w:trPr>
+          <w:jc w:val="center"/>
+        </w:trPr>
+        <w:tc>
+          <w:tcPr>
+            <w:tcW w:w="1296" w:type="dxa"/>
+          </w:tcPr>
+          <w:p>
+            <w:pPr>
+              <w:rPr>
+                <w:sz w:val="16"/>
+                <w:szCs w:val="18"/>
+              </w:rPr>
+            </w:pPr>
+            <w:r>
+              <w:rPr>
+                <w:sz w:val="16"/>
+                <w:szCs w:val="18"/>
+              </w:rPr>
+              <w:t>CTRL-0009</w:t>
+            </w:r>
+          </w:p>
+        </w:tc>
+        <w:tc>
+          <w:tcPr>
+            <w:tcW w:w="2304" w:type="dxa"/>
+          </w:tcPr>
+          <w:p>
+            <w:pPr>
+              <w:rPr>
+                <w:sz w:val="16"/>
+                <w:szCs w:val="18"/>
+                <w:lang w:val="es-MX"/>
+              </w:rPr>
+            </w:pPr>
+            <w:r>
+              <w:rPr>
+                <w:sz w:val="16"/>
+                <w:szCs w:val="18"/>
+                <w:lang w:val="es-MX"/>
+              </w:rPr>
+              <w:t xml:space="preserve">Registrar responsables y </w:t>
+            </w:r>
+            <w:r>
+              <w:rPr>
+                <w:rFonts w:hint="cs"/>
+                <w:sz w:val="16"/>
+                <w:szCs w:val="18"/>
+                <w:lang w:val="es-MX"/>
+              </w:rPr>
+              <w:t>á</w:t>
+            </w:r>
+            <w:r>
+              <w:rPr>
+                <w:sz w:val="16"/>
+                <w:szCs w:val="18"/>
+                <w:lang w:val="es-MX"/>
+              </w:rPr>
+              <w:t>reas involucradas en cada ADR</w:t>
+            </w:r>
+          </w:p>
+        </w:tc>
+        <w:tc>
+          <w:tcPr>
+            <w:tcW w:w="2232" w:type="dxa"/>
+          </w:tcPr>
+          <w:p>
+            <w:pPr>
+              <w:rPr>
+                <w:sz w:val="16"/>
+                <w:szCs w:val="18"/>
+                <w:lang w:val="es-MX"/>
+              </w:rPr>
+            </w:pPr>
+            <w:r>
+              <w:rPr>
+                <w:sz w:val="16"/>
+                <w:szCs w:val="18"/>
+                <w:lang w:val="es-MX"/>
+              </w:rPr>
+              <w:t>Reducir ambig</w:t>
+            </w:r>
+            <w:r>
+              <w:rPr>
+                <w:rFonts w:hint="cs"/>
+                <w:sz w:val="16"/>
+                <w:szCs w:val="18"/>
+                <w:lang w:val="es-MX"/>
+              </w:rPr>
+              <w:t>ü</w:t>
+            </w:r>
+            <w:r>
+              <w:rPr>
+                <w:sz w:val="16"/>
+                <w:szCs w:val="18"/>
+                <w:lang w:val="es-MX"/>
+              </w:rPr>
+              <w:t>edad sobre ownership de la decisi</w:t>
+            </w:r>
+            <w:r>
+              <w:rPr>
+                <w:rFonts w:hint="cs"/>
+                <w:sz w:val="16"/>
+                <w:szCs w:val="18"/>
+                <w:lang w:val="es-MX"/>
+              </w:rPr>
+              <w:t>ó</w:t>
+            </w:r>
+            <w:r>
+              <w:rPr>
+                <w:sz w:val="16"/>
+                <w:szCs w:val="18"/>
+                <w:lang w:val="es-MX"/>
+              </w:rPr>
+              <w:t>n y facilitar seguimiento, aprobaci</w:t>
+            </w:r>
+            <w:r>
+              <w:rPr>
+                <w:rFonts w:hint="cs"/>
+                <w:sz w:val="16"/>
+                <w:szCs w:val="18"/>
+                <w:lang w:val="es-MX"/>
+              </w:rPr>
+              <w:t>ó</w:t>
+            </w:r>
+            <w:r>
+              <w:rPr>
+                <w:sz w:val="16"/>
+                <w:szCs w:val="18"/>
+                <w:lang w:val="es-MX"/>
+              </w:rPr>
+              <w:t>n o revisi</w:t>
+            </w:r>
+            <w:r>
+              <w:rPr>
+                <w:rFonts w:hint="cs"/>
+                <w:sz w:val="16"/>
+                <w:szCs w:val="18"/>
+                <w:lang w:val="es-MX"/>
+              </w:rPr>
+              <w:t>ó</w:t>
+            </w:r>
+            <w:r>
+              <w:rPr>
+                <w:sz w:val="16"/>
+                <w:szCs w:val="18"/>
+                <w:lang w:val="es-MX"/>
+              </w:rPr>
+              <w:t>n futura.</w:t>
+            </w:r>
+          </w:p>
+        </w:tc>
+        <w:tc>
+          <w:tcPr>
+            <w:tcW w:w="1800" w:type="dxa"/>
+          </w:tcPr>
+          <w:p>
+            <w:pPr>
+              <w:rPr>
+                <w:sz w:val="16"/>
+                <w:szCs w:val="18"/>
+                <w:lang w:val="es-MX"/>
+              </w:rPr>
+            </w:pPr>
+            <w:r>
+              <w:rPr>
+                <w:sz w:val="16"/>
+                <w:szCs w:val="18"/>
+                <w:lang w:val="es-MX"/>
+              </w:rPr>
+              <w:t>Arquitectura Empresarial / Arquitectura de Soluci</w:t>
+            </w:r>
+            <w:r>
+              <w:rPr>
+                <w:rFonts w:hint="cs"/>
+                <w:sz w:val="16"/>
+                <w:szCs w:val="18"/>
+                <w:lang w:val="es-MX"/>
+              </w:rPr>
+              <w:t>ó</w:t>
+            </w:r>
+            <w:r>
+              <w:rPr>
+                <w:sz w:val="16"/>
+                <w:szCs w:val="18"/>
+                <w:lang w:val="es-MX"/>
+              </w:rPr>
+              <w:t>n / Negocio</w:t>
+            </w:r>
+          </w:p>
+        </w:tc>
+        <w:tc>
+          <w:tcPr>
+            <w:tcW w:w="1944" w:type="dxa"/>
+          </w:tcPr>
+          <w:p>
+            <w:pPr>
+              <w:rPr>
+                <w:sz w:val="16"/>
+                <w:szCs w:val="18"/>
+              </w:rPr>
+            </w:pPr>
+            <w:r>
+              <w:rPr>
+                <w:sz w:val="16"/>
+                <w:szCs w:val="18"/>
+              </w:rPr>
+              <w:t>Prioritaria</w:t>
+            </w:r>
+          </w:p>
+        </w:tc>
+      </w:tr>
+      <w:tr>
+        <w:trPr>
+          <w:jc w:val="center"/>
+        </w:trPr>
+        <w:tc>
+          <w:tcPr>
+            <w:tcW w:w="1296" w:type="dxa"/>
+          </w:tcPr>
+          <w:p>
+            <w:pPr>
+              <w:rPr>
+                <w:sz w:val="16"/>
+                <w:szCs w:val="18"/>
+              </w:rPr>
+            </w:pPr>
+            <w:r>
+              <w:rPr>
+                <w:sz w:val="16"/>
+                <w:szCs w:val="18"/>
+              </w:rPr>
+              <w:lastRenderedPageBreak/>
+              <w:t>CTRL-0010</w:t>
+            </w:r>
+          </w:p>
+        </w:tc>
+        <w:tc>
+          <w:tcPr>
+            <w:tcW w:w="2304" w:type="dxa"/>
+          </w:tcPr>
+          <w:p>
+            <w:pPr>
+              <w:rPr>
+                <w:sz w:val="16"/>
+                <w:szCs w:val="18"/>
+                <w:lang w:val="es-MX"/>
+              </w:rPr>
+            </w:pPr>
+            <w:r>
+              <w:rPr>
+                <w:sz w:val="16"/>
+                <w:szCs w:val="18"/>
+                <w:lang w:val="es-MX"/>
+              </w:rPr>
+              <w:t>Actualizar artefactos relacionados cuando un ADR sea aceptado</w:t>
+            </w:r>
+          </w:p>
+        </w:tc>
+        <w:tc>
+          <w:tcPr>
+            <w:tcW w:w="2232" w:type="dxa"/>
+          </w:tcPr>
+          <w:p>
+            <w:pPr>
+              <w:rPr>
+                <w:sz w:val="16"/>
+                <w:szCs w:val="18"/>
+                <w:lang w:val="es-MX"/>
+              </w:rPr>
+            </w:pPr>
+            <w:r>
+              <w:rPr>
+                <w:sz w:val="16"/>
+                <w:szCs w:val="18"/>
+                <w:lang w:val="es-MX"/>
+              </w:rPr>
+              <w:t>Asegurar que diagramas, matrices, inventarios, documentos de soluci</w:t>
+            </w:r>
+            <w:r>
+              <w:rPr>
+                <w:rFonts w:hint="cs"/>
+                <w:sz w:val="16"/>
+                <w:szCs w:val="18"/>
+                <w:lang w:val="es-MX"/>
+              </w:rPr>
+              <w:t>ó</w:t>
+            </w:r>
+            <w:r>
+              <w:rPr>
+                <w:sz w:val="16"/>
+                <w:szCs w:val="18"/>
+                <w:lang w:val="es-MX"/>
+              </w:rPr>
+              <w:t>n, riesgos y controles reflejen la decisi</w:t>
+            </w:r>
+            <w:r>
+              <w:rPr>
+                <w:rFonts w:hint="cs"/>
+                <w:sz w:val="16"/>
+                <w:szCs w:val="18"/>
+                <w:lang w:val="es-MX"/>
+              </w:rPr>
+              <w:t>ó</w:t>
+            </w:r>
+            <w:r>
+              <w:rPr>
+                <w:sz w:val="16"/>
+                <w:szCs w:val="18"/>
+                <w:lang w:val="es-MX"/>
+              </w:rPr>
+              <w:t>n tomada.</w:t>
+            </w:r>
+          </w:p>
+        </w:tc>
+        <w:tc>
+          <w:tcPr>
+            <w:tcW w:w="1800" w:type="dxa"/>
+          </w:tcPr>
+          <w:p>
+            <w:pPr>
+              <w:rPr>
+                <w:sz w:val="16"/>
+                <w:szCs w:val="18"/>
+                <w:lang w:val="es-MX"/>
+              </w:rPr>
+            </w:pPr>
+            <w:r>
+              <w:rPr>
+                <w:sz w:val="16"/>
+                <w:szCs w:val="18"/>
+                <w:lang w:val="es-MX"/>
+              </w:rPr>
+              <w:t>Arquitectura de Soluci</w:t>
+            </w:r>
+            <w:r>
+              <w:rPr>
+                <w:rFonts w:hint="cs"/>
+                <w:sz w:val="16"/>
+                <w:szCs w:val="18"/>
+                <w:lang w:val="es-MX"/>
+              </w:rPr>
+              <w:t>ó</w:t>
+            </w:r>
+            <w:r>
+              <w:rPr>
+                <w:sz w:val="16"/>
+                <w:szCs w:val="18"/>
+                <w:lang w:val="es-MX"/>
+              </w:rPr>
+              <w:t>n / Responsables de artefactos</w:t>
+            </w:r>
+          </w:p>
+        </w:tc>
+        <w:tc>
+          <w:tcPr>
+            <w:tcW w:w="1944" w:type="dxa"/>
+          </w:tcPr>
+          <w:p>
+            <w:pPr>
+              <w:rPr>
+                <w:sz w:val="16"/>
+                <w:szCs w:val="18"/>
+              </w:rPr>
+            </w:pPr>
+            <w:r>
+              <w:rPr>
+                <w:sz w:val="16"/>
+                <w:szCs w:val="18"/>
+              </w:rPr>
+              <w:t>Prioritaria</w:t>
+            </w:r>
+          </w:p>
         </w:tc>
       </w:tr>
     </w:tbl>
@@ -3101,7 +4899,56 @@
           <w:tcPr>
             <w:tcW w:w="6696" w:type="dxa"/>
           </w:tcPr>
-          <w:p/>
+          <w:p>
+            <w:pPr>
+              <w:rPr>
+                <w:sz w:val="16"/>
+                <w:szCs w:val="18"/>
+                <w:lang w:val="es-MX"/>
+              </w:rPr>
+            </w:pPr>
+            <w:r>
+              <w:rPr>
+                <w:sz w:val="16"/>
+                <w:szCs w:val="18"/>
+                <w:lang w:val="es-MX"/>
+              </w:rPr>
+              <w:t>Registro documentado de decisiones.</w:t>
+            </w:r>
+          </w:p>
+          <w:p>
+            <w:pPr>
+              <w:rPr>
+                <w:sz w:val="16"/>
+                <w:szCs w:val="18"/>
+                <w:lang w:val="es-MX"/>
+              </w:rPr>
+            </w:pPr>
+            <w:r>
+              <w:rPr>
+                <w:sz w:val="16"/>
+                <w:szCs w:val="18"/>
+                <w:lang w:val="es-MX"/>
+              </w:rPr>
+              <w:t>I</w:t>
+            </w:r>
+            <w:r>
+              <w:rPr>
+                <w:sz w:val="16"/>
+                <w:szCs w:val="18"/>
+                <w:lang w:val="es-MX"/>
+              </w:rPr>
+              <w:t>n</w:t>
+            </w:r>
+            <w:r>
+              <w:rPr>
+                <w:sz w:val="16"/>
+                <w:szCs w:val="18"/>
+                <w:lang w:val="es-MX"/>
+              </w:rPr>
+              <w:t>dexamiento de decisiones.</w:t>
+            </w:r>
+          </w:p>
         </w:tc>
       </w:tr>
       <w:tr>
@@ -3125,7 +4972,23 @@
           <w:tcPr>
             <w:tcW w:w="6696" w:type="dxa"/>
           </w:tcPr>
-          <w:p/>
+          <w:p>
+            <w:pPr>
+              <w:rPr>
+                <w:sz w:val="16"/>
+                <w:szCs w:val="18"/>
+                <w:lang w:val="es-MX"/>
+              </w:rPr>
+            </w:pPr>
+            <w:r>
+              <w:rPr>
+                <w:sz w:val="16"/>
+                <w:szCs w:val="18"/>
+                <w:lang w:val="es-MX"/>
+              </w:rPr>
+              <w:t>Creación de un pipeline documental que requiere atención y trabajo manual.</w:t>
+            </w:r>
+          </w:p>
         </w:tc>
       </w:tr>
       <w:tr>
@@ -3149,7 +5012,23 @@
           <w:tcPr>
             <w:tcW w:w="6696" w:type="dxa"/>
           </w:tcPr>
-          <w:p/>
+          <w:p>
+            <w:pPr>
+              <w:rPr>
+                <w:sz w:val="16"/>
+                <w:szCs w:val="18"/>
+                <w:lang w:val="es-MX"/>
+              </w:rPr>
+            </w:pPr>
+            <w:r>
+              <w:rPr>
+                <w:sz w:val="16"/>
+                <w:szCs w:val="18"/>
+                <w:lang w:val="es-MX"/>
+              </w:rPr>
+              <w:t>Tiempo invertido en mantener la documentación al día, contra costos de recursos económicos y de tiempo presentes y futuros invertidos en documentar y revisar las decisiones de diseño.</w:t>
+            </w:r>
+          </w:p>
         </w:tc>
       </w:tr>
       <w:tr>
@@ -3173,11 +5052,41 @@
           <w:tcPr>
             <w:tcW w:w="6696" w:type="dxa"/>
           </w:tcPr>
-          <w:p/>
+          <w:p>
+            <w:pPr>
+              <w:rPr>
+                <w:sz w:val="16"/>
+                <w:szCs w:val="18"/>
+                <w:lang w:val="es-MX"/>
+              </w:rPr>
+            </w:pPr>
+            <w:r>
+              <w:rPr>
+                <w:sz w:val="16"/>
+                <w:szCs w:val="18"/>
+                <w:lang w:val="es-MX"/>
+              </w:rPr>
+              <w:t>Sin restricciones futuras al m</w:t>
+            </w:r>
+            <w:r>
+              <w:rPr>
+                <w:sz w:val="16"/>
+                <w:szCs w:val="18"/>
+                <w:lang w:val="es-MX"/>
+              </w:rPr>
+              <w:t>omento.</w:t>
+            </w:r>
+          </w:p>
         </w:tc>
       </w:tr>
     </w:tbl>
-    <w:p/>
+    <w:p>
+      <w:pPr>
+        <w:rPr>
+          <w:lang w:val="es-MX"/>
+        </w:rPr>
+      </w:pPr>
+    </w:p>
     <w:p>
       <w:pPr>
         <w:pStyle w:val="Ttulo1"/>
@@ -3284,7 +5193,11 @@
           <w:tcPr>
             <w:tcW w:w="2880" w:type="dxa"/>
           </w:tcPr>
-          <w:p/>
+          <w:p>
+            <w:r>
+              <w:t>Sin dependencia existente</w:t>
+            </w:r>
+          </w:p>
         </w:tc>
         <w:tc>
           <w:tcPr>
@@ -3301,7 +5214,7 @@
                 <w:sz w:val="17"/>
                 <w:lang w:val="es-MX"/>
               </w:rPr>
-              <w:t>Técnica / Negocio / Proveedor / Datos / Seguridad / Operación</w:t>
+              <w:t>Negocio</w:t>
             </w:r>
           </w:p>
         </w:tc>
@@ -3315,6 +5228,12 @@
                 <w:lang w:val="es-MX"/>
               </w:rPr>
             </w:pPr>
+            <w:r>
+              <w:rPr>
+                <w:lang w:val="es-MX"/>
+              </w:rPr>
+              <w:t>NA</w:t>
+            </w:r>
           </w:p>
         </w:tc>
         <w:tc>
@@ -3322,33 +5241,11 @@
             <w:tcW w:w="1800" w:type="dxa"/>
           </w:tcPr>
           <w:p>
-            <w:proofErr w:type="spellStart"/>
             <w:r>
               <w:rPr>
                 <w:sz w:val="17"/>
               </w:rPr>
               <w:t>Abierta</w:t>
-            </w:r>
-            <w:proofErr w:type="spellEnd"/>
-            <w:r>
-              <w:rPr>
-                <w:sz w:val="17"/>
-              </w:rPr>
-              <w:t xml:space="preserve"> / En </w:t>
-            </w:r>
-            <w:proofErr w:type="spellStart"/>
-            <w:r>
-              <w:rPr>
-                <w:sz w:val="17"/>
-              </w:rPr>
-              <w:t>curso</w:t>
-            </w:r>
-            <w:proofErr w:type="spellEnd"/>
-            <w:r>
-              <w:rPr>
-                <w:sz w:val="17"/>
-              </w:rPr>
-              <w:t xml:space="preserve"> / Cerrada</w:t>
             </w:r>
           </w:p>
         </w:tc>
@@ -3486,13 +5383,21 @@
           <w:tcPr>
             <w:tcW w:w="3311" w:type="dxa"/>
           </w:tcPr>
-          <w:p/>
+          <w:p>
+            <w:r>
+              <w:t>NA</w:t>
+            </w:r>
+          </w:p>
         </w:tc>
         <w:tc>
           <w:tcPr>
             <w:tcW w:w="3384" w:type="dxa"/>
           </w:tcPr>
-          <w:p/>
+          <w:p>
+            <w:r>
+              <w:t>NA</w:t>
+            </w:r>
+          </w:p>
         </w:tc>
       </w:tr>
       <w:tr>
@@ -3598,7 +5503,6 @@
               <w:rPr>
                 <w:sz w:val="17"/>
               </w:rPr>
-              <w:lastRenderedPageBreak/>
               <w:t>Backlog / Epic / Ticket</w:t>
             </w:r>
           </w:p>
@@ -4183,6 +6087,7 @@
         <w:pStyle w:val="Ttulo1"/>
       </w:pPr>
       <w:r>
+        <w:lastRenderedPageBreak/>
         <w:t>16. Historial de cambios</w:t>
       </w:r>
     </w:p>
@@ -4313,19 +6218,11 @@
           <w:lang w:val="es-MX"/>
         </w:rPr>
       </w:pPr>
-      <w:proofErr w:type="gramStart"/>
       <w:r>
         <w:rPr>
           <w:lang w:val="es-MX"/>
         </w:rPr>
-        <w:t>[ ]</w:t>
-      </w:r>
-      <w:proofErr w:type="gramEnd"/>
-      <w:r>
-        <w:rPr>
-          <w:lang w:val="es-MX"/>
-        </w:rPr>
-        <w:t xml:space="preserve"> Tiene ID único y título claro.</w:t>
+        <w:t>[ ] Tiene ID único y título claro.</w:t>
       </w:r>
     </w:p>
     <w:p>
@@ -4335,19 +6232,11 @@
           <w:lang w:val="es-MX"/>
         </w:rPr>
       </w:pPr>
-      <w:proofErr w:type="gramStart"/>
       <w:r>
         <w:rPr>
           <w:lang w:val="es-MX"/>
         </w:rPr>
-        <w:t>[ ]</w:t>
-      </w:r>
-      <w:proofErr w:type="gramEnd"/>
-      <w:r>
-        <w:rPr>
-          <w:lang w:val="es-MX"/>
-        </w:rPr>
-        <w:t xml:space="preserve"> Tiene estado, fecha y responsable.</w:t>
+        <w:t>[ ] Tiene estado, fecha y responsable.</w:t>
       </w:r>
     </w:p>
     <w:p>
@@ -4357,19 +6246,11 @@
           <w:lang w:val="es-MX"/>
         </w:rPr>
       </w:pPr>
-      <w:proofErr w:type="gramStart"/>
       <w:r>
         <w:rPr>
           <w:lang w:val="es-MX"/>
         </w:rPr>
-        <w:t>[ ]</w:t>
-      </w:r>
-      <w:proofErr w:type="gramEnd"/>
-      <w:r>
-        <w:rPr>
-          <w:lang w:val="es-MX"/>
-        </w:rPr>
-        <w:t xml:space="preserve"> Tiene contexto y pregunta arquitectónica.</w:t>
+        <w:t>[ ] Tiene contexto y pregunta arquitectónica.</w:t>
       </w:r>
     </w:p>
     <w:p>
@@ -4379,19 +6260,11 @@
           <w:lang w:val="es-MX"/>
         </w:rPr>
       </w:pPr>
-      <w:proofErr w:type="gramStart"/>
       <w:r>
         <w:rPr>
           <w:lang w:val="es-MX"/>
         </w:rPr>
-        <w:t>[ ]</w:t>
-      </w:r>
-      <w:proofErr w:type="gramEnd"/>
-      <w:r>
-        <w:rPr>
-          <w:lang w:val="es-MX"/>
-        </w:rPr>
-        <w:t xml:space="preserve"> Tiene decisión explícita y alternativas evaluadas.</w:t>
+        <w:t>[ ] Tiene decisión explícita y alternativas evaluadas.</w:t>
       </w:r>
     </w:p>
     <w:p>
@@ -4401,33 +6274,11 @@
           <w:lang w:val="es-MX"/>
         </w:rPr>
       </w:pPr>
-      <w:proofErr w:type="gramStart"/>
       <w:r>
         <w:rPr>
           <w:lang w:val="es-MX"/>
         </w:rPr>
-        <w:t>[ ]</w:t>
-      </w:r>
-      <w:proofErr w:type="gramEnd"/>
-      <w:r>
-        <w:rPr>
-          <w:lang w:val="es-MX"/>
-        </w:rPr>
-        <w:t xml:space="preserve"> Tiene justificación, consecuencias y </w:t>
-      </w:r>
-      <w:proofErr w:type="spellStart"/>
-      <w:r>
-        <w:rPr>
-          <w:lang w:val="es-MX"/>
-        </w:rPr>
-        <w:t>trade-offs</w:t>
-      </w:r>
-      <w:proofErr w:type="spellEnd"/>
-      <w:r>
-        <w:rPr>
-          <w:lang w:val="es-MX"/>
-        </w:rPr>
-        <w:t>.</w:t>
+        <w:t>[ ] Tiene justificación, consecuencias y trade-offs.</w:t>
       </w:r>
     </w:p>
     <w:p>
@@ -4437,19 +6288,11 @@
           <w:lang w:val="es-MX"/>
         </w:rPr>
       </w:pPr>
-      <w:proofErr w:type="gramStart"/>
       <w:r>
         <w:rPr>
           <w:lang w:val="es-MX"/>
         </w:rPr>
-        <w:t>[ ]</w:t>
-      </w:r>
-      <w:proofErr w:type="gramEnd"/>
-      <w:r>
-        <w:rPr>
-          <w:lang w:val="es-MX"/>
-        </w:rPr>
-        <w:t xml:space="preserve"> Tiene impacto APS y análisis LEM cuando aplica.</w:t>
+        <w:t>[ ] Tiene impacto APS y análisis LEM cuando aplica.</w:t>
       </w:r>
     </w:p>
     <w:p>
@@ -4459,19 +6302,11 @@
           <w:lang w:val="es-MX"/>
         </w:rPr>
       </w:pPr>
-      <w:proofErr w:type="gramStart"/>
       <w:r>
         <w:rPr>
           <w:lang w:val="es-MX"/>
         </w:rPr>
-        <w:t>[ ]</w:t>
-      </w:r>
-      <w:proofErr w:type="gramEnd"/>
-      <w:r>
-        <w:rPr>
-          <w:lang w:val="es-MX"/>
-        </w:rPr>
-        <w:t xml:space="preserve"> Tiene riesgos relacionados, riesgo residual y controles cuando aplica.</w:t>
+        <w:t>[ ] Tiene riesgos relacionados, riesgo residual y controles cuando aplica.</w:t>
       </w:r>
     </w:p>
     <w:p>
@@ -4481,33 +6316,11 @@
           <w:lang w:val="es-MX"/>
         </w:rPr>
       </w:pPr>
-      <w:proofErr w:type="gramStart"/>
       <w:r>
         <w:rPr>
           <w:lang w:val="es-MX"/>
         </w:rPr>
-        <w:t>[ ]</w:t>
-      </w:r>
-      <w:proofErr w:type="gramEnd"/>
-      <w:r>
-        <w:rPr>
-          <w:lang w:val="es-MX"/>
-        </w:rPr>
-        <w:t xml:space="preserve"> Está registrado en </w:t>
-      </w:r>
-      <w:proofErr w:type="spellStart"/>
-      <w:r>
-        <w:rPr>
-          <w:lang w:val="es-MX"/>
-        </w:rPr>
-        <w:t>registers</w:t>
-      </w:r>
-      <w:proofErr w:type="spellEnd"/>
-      <w:r>
-        <w:rPr>
-          <w:lang w:val="es-MX"/>
-        </w:rPr>
-        <w:t>/decision-log.xlsx.</w:t>
+        <w:t>[ ] Está registrado en registers/decision-log.xlsx.</w:t>
       </w:r>
     </w:p>
     <w:p>
@@ -4517,19 +6330,11 @@
           <w:lang w:val="es-MX"/>
         </w:rPr>
       </w:pPr>
-      <w:proofErr w:type="gramStart"/>
       <w:r>
         <w:rPr>
           <w:lang w:val="es-MX"/>
         </w:rPr>
-        <w:t>[ ]</w:t>
-      </w:r>
-      <w:proofErr w:type="gramEnd"/>
-      <w:r>
-        <w:rPr>
-          <w:lang w:val="es-MX"/>
-        </w:rPr>
-        <w:t xml:space="preserve"> Los artefactos relacionados fueron actualizados o identificados.</w:t>
+        <w:t>[ ] Los artefactos relacionados fueron actualizados o identificados.</w:t>
       </w:r>
     </w:p>
     <w:sectPr>
@@ -4628,49 +6433,8 @@
         <w:color w:val="646464"/>
         <w:sz w:val="16"/>
       </w:rPr>
-      <w:t xml:space="preserve">RDA - </w:t>
+      <w:t>RDA - Repositorio de Decisiones Arquitectónicas</w:t>
     </w:r>
-    <w:proofErr w:type="spellStart"/>
-    <w:r>
-      <w:rPr>
-        <w:color w:val="646464"/>
-        <w:sz w:val="16"/>
-      </w:rPr>
-      <w:t>Repositorio</w:t>
-    </w:r>
-    <w:proofErr w:type="spellEnd"/>
-    <w:r>
-      <w:rPr>
-        <w:color w:val="646464"/>
-        <w:sz w:val="16"/>
-      </w:rPr>
-      <w:t xml:space="preserve"> de </w:t>
-    </w:r>
-    <w:proofErr w:type="spellStart"/>
-    <w:r>
-      <w:rPr>
-        <w:color w:val="646464"/>
-        <w:sz w:val="16"/>
-      </w:rPr>
-      <w:t>Decisiones</w:t>
-    </w:r>
-    <w:proofErr w:type="spellEnd"/>
-    <w:r>
-      <w:rPr>
-        <w:color w:val="646464"/>
-        <w:sz w:val="16"/>
-      </w:rPr>
-      <w:t xml:space="preserve"> </w:t>
-    </w:r>
-    <w:proofErr w:type="spellStart"/>
-    <w:r>
-      <w:rPr>
-        <w:color w:val="646464"/>
-        <w:sz w:val="16"/>
-      </w:rPr>
-      <w:t>Arquitectónicas</w:t>
-    </w:r>
-    <w:proofErr w:type="spellEnd"/>
   </w:p>
 </w:hdr>
 </file>
@@ -4848,6 +6612,453 @@
       </w:rPr>
     </w:lvl>
   </w:abstractNum>
+  <w:abstractNum w:abstractNumId="9" w15:restartNumberingAfterBreak="0">
+    <w:nsid w:val="30185514"/>
+    <w:multiLevelType w:val="multilevel"/>
+    <w:tmpl w:val="38488050"/>
+    <w:lvl w:ilvl="0">
+      <w:start w:val="1"/>
+      <w:numFmt w:val="bullet"/>
+      <w:lvlText w:val=""/>
+      <w:lvlJc w:val="left"/>
+      <w:pPr>
+        <w:tabs>
+          <w:tab w:val="num" w:pos="720"/>
+        </w:tabs>
+        <w:ind w:left="720" w:hanging="360"/>
+      </w:pPr>
+      <w:rPr>
+        <w:rFonts w:ascii="Symbol" w:hAnsi="Symbol" w:hint="default"/>
+        <w:sz w:val="20"/>
+      </w:rPr>
+    </w:lvl>
+    <w:lvl w:ilvl="1" w:tentative="1">
+      <w:start w:val="1"/>
+      <w:numFmt w:val="bullet"/>
+      <w:lvlText w:val="o"/>
+      <w:lvlJc w:val="left"/>
+      <w:pPr>
+        <w:tabs>
+          <w:tab w:val="num" w:pos="1440"/>
+        </w:tabs>
+        <w:ind w:left="1440" w:hanging="360"/>
+      </w:pPr>
+      <w:rPr>
+        <w:rFonts w:ascii="Courier New" w:hAnsi="Courier New" w:hint="default"/>
+        <w:sz w:val="20"/>
+      </w:rPr>
+    </w:lvl>
+    <w:lvl w:ilvl="2" w:tentative="1">
+      <w:start w:val="1"/>
+      <w:numFmt w:val="bullet"/>
+      <w:lvlText w:val=""/>
+      <w:lvlJc w:val="left"/>
+      <w:pPr>
+        <w:tabs>
+          <w:tab w:val="num" w:pos="2160"/>
+        </w:tabs>
+        <w:ind w:left="2160" w:hanging="360"/>
+      </w:pPr>
+      <w:rPr>
+        <w:rFonts w:ascii="Wingdings" w:hAnsi="Wingdings" w:hint="default"/>
+        <w:sz w:val="20"/>
+      </w:rPr>
+    </w:lvl>
+    <w:lvl w:ilvl="3" w:tentative="1">
+      <w:start w:val="1"/>
+      <w:numFmt w:val="bullet"/>
+      <w:lvlText w:val=""/>
+      <w:lvlJc w:val="left"/>
+      <w:pPr>
+        <w:tabs>
+          <w:tab w:val="num" w:pos="2880"/>
+        </w:tabs>
+        <w:ind w:left="2880" w:hanging="360"/>
+      </w:pPr>
+      <w:rPr>
+        <w:rFonts w:ascii="Wingdings" w:hAnsi="Wingdings" w:hint="default"/>
+        <w:sz w:val="20"/>
+      </w:rPr>
+    </w:lvl>
+    <w:lvl w:ilvl="4" w:tentative="1">
+      <w:start w:val="1"/>
+      <w:numFmt w:val="bullet"/>
+      <w:lvlText w:val=""/>
+      <w:lvlJc w:val="left"/>
+      <w:pPr>
+        <w:tabs>
+          <w:tab w:val="num" w:pos="3600"/>
+        </w:tabs>
+        <w:ind w:left="3600" w:hanging="360"/>
+      </w:pPr>
+      <w:rPr>
+        <w:rFonts w:ascii="Wingdings" w:hAnsi="Wingdings" w:hint="default"/>
+        <w:sz w:val="20"/>
+      </w:rPr>
+    </w:lvl>
+    <w:lvl w:ilvl="5" w:tentative="1">
+      <w:start w:val="1"/>
+      <w:numFmt w:val="bullet"/>
+      <w:lvlText w:val=""/>
+      <w:lvlJc w:val="left"/>
+      <w:pPr>
+        <w:tabs>
+          <w:tab w:val="num" w:pos="4320"/>
+        </w:tabs>
+        <w:ind w:left="4320" w:hanging="360"/>
+      </w:pPr>
+      <w:rPr>
+        <w:rFonts w:ascii="Wingdings" w:hAnsi="Wingdings" w:hint="default"/>
+        <w:sz w:val="20"/>
+      </w:rPr>
+    </w:lvl>
+    <w:lvl w:ilvl="6" w:tentative="1">
+      <w:start w:val="1"/>
+      <w:numFmt w:val="bullet"/>
+      <w:lvlText w:val=""/>
+      <w:lvlJc w:val="left"/>
+      <w:pPr>
+        <w:tabs>
+          <w:tab w:val="num" w:pos="5040"/>
+        </w:tabs>
+        <w:ind w:left="5040" w:hanging="360"/>
+      </w:pPr>
+      <w:rPr>
+        <w:rFonts w:ascii="Wingdings" w:hAnsi="Wingdings" w:hint="default"/>
+        <w:sz w:val="20"/>
+      </w:rPr>
+    </w:lvl>
+    <w:lvl w:ilvl="7" w:tentative="1">
+      <w:start w:val="1"/>
+      <w:numFmt w:val="bullet"/>
+      <w:lvlText w:val=""/>
+      <w:lvlJc w:val="left"/>
+      <w:pPr>
+        <w:tabs>
+          <w:tab w:val="num" w:pos="5760"/>
+        </w:tabs>
+        <w:ind w:left="5760" w:hanging="360"/>
+      </w:pPr>
+      <w:rPr>
+        <w:rFonts w:ascii="Wingdings" w:hAnsi="Wingdings" w:hint="default"/>
+        <w:sz w:val="20"/>
+      </w:rPr>
+    </w:lvl>
+    <w:lvl w:ilvl="8" w:tentative="1">
+      <w:start w:val="1"/>
+      <w:numFmt w:val="bullet"/>
+      <w:lvlText w:val=""/>
+      <w:lvlJc w:val="left"/>
+      <w:pPr>
+        <w:tabs>
+          <w:tab w:val="num" w:pos="6480"/>
+        </w:tabs>
+        <w:ind w:left="6480" w:hanging="360"/>
+      </w:pPr>
+      <w:rPr>
+        <w:rFonts w:ascii="Wingdings" w:hAnsi="Wingdings" w:hint="default"/>
+        <w:sz w:val="20"/>
+      </w:rPr>
+    </w:lvl>
+  </w:abstractNum>
+  <w:abstractNum w:abstractNumId="10" w15:restartNumberingAfterBreak="0">
+    <w:nsid w:val="69DF5D9D"/>
+    <w:multiLevelType w:val="multilevel"/>
+    <w:tmpl w:val="57942308"/>
+    <w:lvl w:ilvl="0">
+      <w:start w:val="1"/>
+      <w:numFmt w:val="bullet"/>
+      <w:lvlText w:val=""/>
+      <w:lvlJc w:val="left"/>
+      <w:pPr>
+        <w:tabs>
+          <w:tab w:val="num" w:pos="720"/>
+        </w:tabs>
+        <w:ind w:left="720" w:hanging="360"/>
+      </w:pPr>
+      <w:rPr>
+        <w:rFonts w:ascii="Symbol" w:hAnsi="Symbol" w:hint="default"/>
+        <w:sz w:val="20"/>
+      </w:rPr>
+    </w:lvl>
+    <w:lvl w:ilvl="1" w:tentative="1">
+      <w:start w:val="1"/>
+      <w:numFmt w:val="bullet"/>
+      <w:lvlText w:val="o"/>
+      <w:lvlJc w:val="left"/>
+      <w:pPr>
+        <w:tabs>
+          <w:tab w:val="num" w:pos="1440"/>
+        </w:tabs>
+        <w:ind w:left="1440" w:hanging="360"/>
+      </w:pPr>
+      <w:rPr>
+        <w:rFonts w:ascii="Courier New" w:hAnsi="Courier New" w:hint="default"/>
+        <w:sz w:val="20"/>
+      </w:rPr>
+    </w:lvl>
+    <w:lvl w:ilvl="2" w:tentative="1">
+      <w:start w:val="1"/>
+      <w:numFmt w:val="bullet"/>
+      <w:lvlText w:val=""/>
+      <w:lvlJc w:val="left"/>
+      <w:pPr>
+        <w:tabs>
+          <w:tab w:val="num" w:pos="2160"/>
+        </w:tabs>
+        <w:ind w:left="2160" w:hanging="360"/>
+      </w:pPr>
+      <w:rPr>
+        <w:rFonts w:ascii="Wingdings" w:hAnsi="Wingdings" w:hint="default"/>
+        <w:sz w:val="20"/>
+      </w:rPr>
+    </w:lvl>
+    <w:lvl w:ilvl="3" w:tentative="1">
+      <w:start w:val="1"/>
+      <w:numFmt w:val="bullet"/>
+      <w:lvlText w:val=""/>
+      <w:lvlJc w:val="left"/>
+      <w:pPr>
+        <w:tabs>
+          <w:tab w:val="num" w:pos="2880"/>
+        </w:tabs>
+        <w:ind w:left="2880" w:hanging="360"/>
+      </w:pPr>
+      <w:rPr>
+        <w:rFonts w:ascii="Wingdings" w:hAnsi="Wingdings" w:hint="default"/>
+        <w:sz w:val="20"/>
+      </w:rPr>
+    </w:lvl>
+    <w:lvl w:ilvl="4" w:tentative="1">
+      <w:start w:val="1"/>
+      <w:numFmt w:val="bullet"/>
+      <w:lvlText w:val=""/>
+      <w:lvlJc w:val="left"/>
+      <w:pPr>
+        <w:tabs>
+          <w:tab w:val="num" w:pos="3600"/>
+        </w:tabs>
+        <w:ind w:left="3600" w:hanging="360"/>
+      </w:pPr>
+      <w:rPr>
+        <w:rFonts w:ascii="Wingdings" w:hAnsi="Wingdings" w:hint="default"/>
+        <w:sz w:val="20"/>
+      </w:rPr>
+    </w:lvl>
+    <w:lvl w:ilvl="5" w:tentative="1">
+      <w:start w:val="1"/>
+      <w:numFmt w:val="bullet"/>
+      <w:lvlText w:val=""/>
+      <w:lvlJc w:val="left"/>
+      <w:pPr>
+        <w:tabs>
+          <w:tab w:val="num" w:pos="4320"/>
+        </w:tabs>
+        <w:ind w:left="4320" w:hanging="360"/>
+      </w:pPr>
+      <w:rPr>
+        <w:rFonts w:ascii="Wingdings" w:hAnsi="Wingdings" w:hint="default"/>
+        <w:sz w:val="20"/>
+      </w:rPr>
+    </w:lvl>
+    <w:lvl w:ilvl="6" w:tentative="1">
+      <w:start w:val="1"/>
+      <w:numFmt w:val="bullet"/>
+      <w:lvlText w:val=""/>
+      <w:lvlJc w:val="left"/>
+      <w:pPr>
+        <w:tabs>
+          <w:tab w:val="num" w:pos="5040"/>
+        </w:tabs>
+        <w:ind w:left="5040" w:hanging="360"/>
+      </w:pPr>
+      <w:rPr>
+        <w:rFonts w:ascii="Wingdings" w:hAnsi="Wingdings" w:hint="default"/>
+        <w:sz w:val="20"/>
+      </w:rPr>
+    </w:lvl>
+    <w:lvl w:ilvl="7" w:tentative="1">
+      <w:start w:val="1"/>
+      <w:numFmt w:val="bullet"/>
+      <w:lvlText w:val=""/>
+      <w:lvlJc w:val="left"/>
+      <w:pPr>
+        <w:tabs>
+          <w:tab w:val="num" w:pos="5760"/>
+        </w:tabs>
+        <w:ind w:left="5760" w:hanging="360"/>
+      </w:pPr>
+      <w:rPr>
+        <w:rFonts w:ascii="Wingdings" w:hAnsi="Wingdings" w:hint="default"/>
+        <w:sz w:val="20"/>
+      </w:rPr>
+    </w:lvl>
+    <w:lvl w:ilvl="8" w:tentative="1">
+      <w:start w:val="1"/>
+      <w:numFmt w:val="bullet"/>
+      <w:lvlText w:val=""/>
+      <w:lvlJc w:val="left"/>
+      <w:pPr>
+        <w:tabs>
+          <w:tab w:val="num" w:pos="6480"/>
+        </w:tabs>
+        <w:ind w:left="6480" w:hanging="360"/>
+      </w:pPr>
+      <w:rPr>
+        <w:rFonts w:ascii="Wingdings" w:hAnsi="Wingdings" w:hint="default"/>
+        <w:sz w:val="20"/>
+      </w:rPr>
+    </w:lvl>
+  </w:abstractNum>
+  <w:abstractNum w:abstractNumId="11" w15:restartNumberingAfterBreak="0">
+    <w:nsid w:val="6AD37E62"/>
+    <w:multiLevelType w:val="multilevel"/>
+    <w:tmpl w:val="A70877E6"/>
+    <w:lvl w:ilvl="0">
+      <w:start w:val="1"/>
+      <w:numFmt w:val="bullet"/>
+      <w:lvlText w:val=""/>
+      <w:lvlJc w:val="left"/>
+      <w:pPr>
+        <w:tabs>
+          <w:tab w:val="num" w:pos="720"/>
+        </w:tabs>
+        <w:ind w:left="720" w:hanging="360"/>
+      </w:pPr>
+      <w:rPr>
+        <w:rFonts w:ascii="Symbol" w:hAnsi="Symbol" w:hint="default"/>
+        <w:sz w:val="20"/>
+      </w:rPr>
+    </w:lvl>
+    <w:lvl w:ilvl="1" w:tentative="1">
+      <w:start w:val="1"/>
+      <w:numFmt w:val="bullet"/>
+      <w:lvlText w:val="o"/>
+      <w:lvlJc w:val="left"/>
+      <w:pPr>
+        <w:tabs>
+          <w:tab w:val="num" w:pos="1440"/>
+        </w:tabs>
+        <w:ind w:left="1440" w:hanging="360"/>
+      </w:pPr>
+      <w:rPr>
+        <w:rFonts w:ascii="Courier New" w:hAnsi="Courier New" w:hint="default"/>
+        <w:sz w:val="20"/>
+      </w:rPr>
+    </w:lvl>
+    <w:lvl w:ilvl="2" w:tentative="1">
+      <w:start w:val="1"/>
+      <w:numFmt w:val="bullet"/>
+      <w:lvlText w:val=""/>
+      <w:lvlJc w:val="left"/>
+      <w:pPr>
+        <w:tabs>
+          <w:tab w:val="num" w:pos="2160"/>
+        </w:tabs>
+        <w:ind w:left="2160" w:hanging="360"/>
+      </w:pPr>
+      <w:rPr>
+        <w:rFonts w:ascii="Wingdings" w:hAnsi="Wingdings" w:hint="default"/>
+        <w:sz w:val="20"/>
+      </w:rPr>
+    </w:lvl>
+    <w:lvl w:ilvl="3" w:tentative="1">
+      <w:start w:val="1"/>
+      <w:numFmt w:val="bullet"/>
+      <w:lvlText w:val=""/>
+      <w:lvlJc w:val="left"/>
+      <w:pPr>
+        <w:tabs>
+          <w:tab w:val="num" w:pos="2880"/>
+        </w:tabs>
+        <w:ind w:left="2880" w:hanging="360"/>
+      </w:pPr>
+      <w:rPr>
+        <w:rFonts w:ascii="Wingdings" w:hAnsi="Wingdings" w:hint="default"/>
+        <w:sz w:val="20"/>
+      </w:rPr>
+    </w:lvl>
+    <w:lvl w:ilvl="4" w:tentative="1">
+      <w:start w:val="1"/>
+      <w:numFmt w:val="bullet"/>
+      <w:lvlText w:val=""/>
+      <w:lvlJc w:val="left"/>
+      <w:pPr>
+        <w:tabs>
+          <w:tab w:val="num" w:pos="3600"/>
+        </w:tabs>
+        <w:ind w:left="3600" w:hanging="360"/>
+      </w:pPr>
+      <w:rPr>
+        <w:rFonts w:ascii="Wingdings" w:hAnsi="Wingdings" w:hint="default"/>
+        <w:sz w:val="20"/>
+      </w:rPr>
+    </w:lvl>
+    <w:lvl w:ilvl="5" w:tentative="1">
+      <w:start w:val="1"/>
+      <w:numFmt w:val="bullet"/>
+      <w:lvlText w:val=""/>
+      <w:lvlJc w:val="left"/>
+      <w:pPr>
+        <w:tabs>
+          <w:tab w:val="num" w:pos="4320"/>
+        </w:tabs>
+        <w:ind w:left="4320" w:hanging="360"/>
+      </w:pPr>
+      <w:rPr>
+        <w:rFonts w:ascii="Wingdings" w:hAnsi="Wingdings" w:hint="default"/>
+        <w:sz w:val="20"/>
+      </w:rPr>
+    </w:lvl>
+    <w:lvl w:ilvl="6" w:tentative="1">
+      <w:start w:val="1"/>
+      <w:numFmt w:val="bullet"/>
+      <w:lvlText w:val=""/>
+      <w:lvlJc w:val="left"/>
+      <w:pPr>
+        <w:tabs>
+          <w:tab w:val="num" w:pos="5040"/>
+        </w:tabs>
+        <w:ind w:left="5040" w:hanging="360"/>
+      </w:pPr>
+      <w:rPr>
+        <w:rFonts w:ascii="Wingdings" w:hAnsi="Wingdings" w:hint="default"/>
+        <w:sz w:val="20"/>
+      </w:rPr>
+    </w:lvl>
+    <w:lvl w:ilvl="7" w:tentative="1">
+      <w:start w:val="1"/>
+      <w:numFmt w:val="bullet"/>
+      <w:lvlText w:val=""/>
+      <w:lvlJc w:val="left"/>
+      <w:pPr>
+        <w:tabs>
+          <w:tab w:val="num" w:pos="5760"/>
+        </w:tabs>
+        <w:ind w:left="5760" w:hanging="360"/>
+      </w:pPr>
+      <w:rPr>
+        <w:rFonts w:ascii="Wingdings" w:hAnsi="Wingdings" w:hint="default"/>
+        <w:sz w:val="20"/>
+      </w:rPr>
+    </w:lvl>
+    <w:lvl w:ilvl="8" w:tentative="1">
+      <w:start w:val="1"/>
+      <w:numFmt w:val="bullet"/>
+      <w:lvlText w:val=""/>
+      <w:lvlJc w:val="left"/>
+      <w:pPr>
+        <w:tabs>
+          <w:tab w:val="num" w:pos="6480"/>
+        </w:tabs>
+        <w:ind w:left="6480" w:hanging="360"/>
+      </w:pPr>
+      <w:rPr>
+        <w:rFonts w:ascii="Wingdings" w:hAnsi="Wingdings" w:hint="default"/>
+        <w:sz w:val="20"/>
+      </w:rPr>
+    </w:lvl>
+  </w:abstractNum>
   <w:num w:numId="1" w16cid:durableId="743457455">
     <w:abstractNumId w:val="8"/>
   </w:num>
@@ -4874,6 +7085,15 @@
   </w:num>
   <w:num w:numId="9" w16cid:durableId="1405104885">
     <w:abstractNumId w:val="0"/>
+  </w:num>
+  <w:num w:numId="10" w16cid:durableId="611286124">
+    <w:abstractNumId w:val="11"/>
+  </w:num>
+  <w:num w:numId="11" w16cid:durableId="534198377">
+    <w:abstractNumId w:val="10"/>
+  </w:num>
+  <w:num w:numId="12" w16cid:durableId="2096971683">
+    <w:abstractNumId w:val="9"/>
   </w:num>
 </w:numbering>
 </file>

</xml_diff>